<commit_message>
Installateur corrigé, guides Word refaits pour OVHcloud, données de démonstration
- installer.php : correction d'un plantage à la création de l'administrateur (fonction manquante) ;
  nouveau test automatique de l'installateur.
- Guides Word (installation et utilisation) refaits pour la version OVHcloud, avec nouvelles captures
  (priorité, créé par, QR code, flèches d'ordre des groupes, connecteur en ligne).
- outils/donnees-demo.php : données d'exemple pour essayer l'application ou faire des captures.

Co-Authored-By: Claude Sonnet 5.5 <noreply@anthropic.com>
Claude-Session: https://claude.ai/code/session_01RVwggSy1jdUVk8AgXBtV5s
</commit_message>
<xml_diff>
--- a/docs/Guide-utilisation-Projets-Le-Roy.docx
+++ b/docs/Guide-utilisation-Projets-Le-Roy.docx
@@ -367,7 +367,7 @@
         <w:t xml:space="preserve">Projets Le Roy</w:t>
       </w:r>
       <w:r>
-        <w:t xml:space="preserve"> sur votre bureau, ou l'adresse donnée par l'administrateur dans votre navigateur (par exemple </w:t>
+        <w:t xml:space="preserve"> sur votre bureau, ou l'adresse du site donnée par l'administrateur dans votre navigateur (par exemple </w:t>
       </w:r>
       <w:r>
         <w:rPr>
@@ -377,10 +377,20 @@
           <w:szCs w:val="20"/>
           <w:shd w:fill="EDEAE8" w:color="auto" w:val="clear"/>
         </w:rPr>
-        <w:t xml:space="preserve">http://192.168.1.25:3000</w:t>
-      </w:r>
-      <w:r>
-        <w:t xml:space="preserve">).</w:t>
+        <w:t xml:space="preserve">https://projets.le-roy.fr</w:t>
+      </w:r>
+      <w:r>
+        <w:t xml:space="preserve">). Sur un téléphone ou une tablette, vous pouvez aussi </w:t>
+      </w:r>
+      <w:r>
+        <w:rPr>
+          <w:b/>
+          <w:bCs/>
+        </w:rPr>
+        <w:t xml:space="preserve">scanner le QR code</w:t>
+      </w:r>
+      <w:r>
+        <w:t xml:space="preserve"> affiché dans la page Compte d'un collègue (voir chapitre 9).</w:t>
       </w:r>
     </w:p>
     <w:p>
@@ -1119,6 +1129,75 @@
               <w:spacing w:after="40"/>
             </w:pPr>
             <w:r>
+              <w:t xml:space="preserve">🔴 Urgent / 🟠 Haute</w:t>
+            </w:r>
+          </w:p>
+        </w:tc>
+        <w:tc>
+          <w:tcPr>
+            <w:tcW w:type="dxa" w:w="6638"/>
+            <w:tcBorders>
+              <w:top w:val="single" w:color="D9D4D1" w:sz="4"/>
+              <w:left w:val="single" w:color="D9D4D1" w:sz="4"/>
+              <w:bottom w:val="single" w:color="D9D4D1" w:sz="4"/>
+              <w:right w:val="single" w:color="D9D4D1" w:sz="4"/>
+            </w:tcBorders>
+            <w:shd w:fill="FFFFFF" w:color="auto" w:val="clear"/>
+            <w:tcMar>
+              <w:top w:type="dxa" w:w="80"/>
+              <w:left w:type="dxa" w:w="120"/>
+              <w:bottom w:type="dxa" w:w="80"/>
+              <w:right w:type="dxa" w:w="120"/>
+            </w:tcMar>
+            <w:vAlign w:val="center"/>
+          </w:tcPr>
+          <w:p>
+            <w:pPr>
+              <w:spacing w:after="40"/>
+            </w:pPr>
+            <w:r>
+              <w:t xml:space="preserve">La </w:t>
+            </w:r>
+            <w:r>
+              <w:rPr>
+                <w:b/>
+                <w:bCs/>
+              </w:rPr>
+              <w:t xml:space="preserve">priorité</w:t>
+            </w:r>
+            <w:r>
+              <w:t xml:space="preserve"> de la tâche (affichée seulement pour « Urgente » et « Haute »). Dans une carte, les tâches les plus prioritaires passent en premier.</w:t>
+            </w:r>
+          </w:p>
+        </w:tc>
+      </w:tr>
+      <w:tr>
+        <w:trPr>
+          <w:cantSplit/>
+        </w:trPr>
+        <w:tc>
+          <w:tcPr>
+            <w:tcW w:type="dxa" w:w="3000"/>
+            <w:tcBorders>
+              <w:top w:val="single" w:color="D9D4D1" w:sz="4"/>
+              <w:left w:val="single" w:color="D9D4D1" w:sz="4"/>
+              <w:bottom w:val="single" w:color="D9D4D1" w:sz="4"/>
+              <w:right w:val="single" w:color="D9D4D1" w:sz="4"/>
+            </w:tcBorders>
+            <w:shd w:fill="F7F5F4" w:color="auto" w:val="clear"/>
+            <w:tcMar>
+              <w:top w:type="dxa" w:w="80"/>
+              <w:left w:type="dxa" w:w="120"/>
+              <w:bottom w:type="dxa" w:w="80"/>
+              <w:right w:type="dxa" w:w="120"/>
+            </w:tcMar>
+            <w:vAlign w:val="center"/>
+          </w:tcPr>
+          <w:p>
+            <w:pPr>
+              <w:spacing w:after="40"/>
+            </w:pPr>
+            <w:r>
               <w:t xml:space="preserve">🚨 En retard · 2 j</w:t>
             </w:r>
           </w:p>
@@ -1132,7 +1211,7 @@
               <w:bottom w:val="single" w:color="D9D4D1" w:sz="4"/>
               <w:right w:val="single" w:color="D9D4D1" w:sz="4"/>
             </w:tcBorders>
-            <w:shd w:fill="FFFFFF" w:color="auto" w:val="clear"/>
+            <w:shd w:fill="F7F5F4" w:color="auto" w:val="clear"/>
             <w:tcMar>
               <w:top w:type="dxa" w:w="80"/>
               <w:left w:type="dxa" w:w="120"/>
@@ -1174,7 +1253,7 @@
               <w:bottom w:val="single" w:color="D9D4D1" w:sz="4"/>
               <w:right w:val="single" w:color="D9D4D1" w:sz="4"/>
             </w:tcBorders>
-            <w:shd w:fill="F7F5F4" w:color="auto" w:val="clear"/>
+            <w:shd w:fill="FFFFFF" w:color="auto" w:val="clear"/>
             <w:tcMar>
               <w:top w:type="dxa" w:w="80"/>
               <w:left w:type="dxa" w:w="120"/>
@@ -1201,7 +1280,7 @@
               <w:bottom w:val="single" w:color="D9D4D1" w:sz="4"/>
               <w:right w:val="single" w:color="D9D4D1" w:sz="4"/>
             </w:tcBorders>
-            <w:shd w:fill="F7F5F4" w:color="auto" w:val="clear"/>
+            <w:shd w:fill="FFFFFF" w:color="auto" w:val="clear"/>
             <w:tcMar>
               <w:top w:type="dxa" w:w="80"/>
               <w:left w:type="dxa" w:w="120"/>
@@ -1243,7 +1322,7 @@
               <w:bottom w:val="single" w:color="D9D4D1" w:sz="4"/>
               <w:right w:val="single" w:color="D9D4D1" w:sz="4"/>
             </w:tcBorders>
-            <w:shd w:fill="FFFFFF" w:color="auto" w:val="clear"/>
+            <w:shd w:fill="F7F5F4" w:color="auto" w:val="clear"/>
             <w:tcMar>
               <w:top w:type="dxa" w:w="80"/>
               <w:left w:type="dxa" w:w="120"/>
@@ -1270,7 +1349,7 @@
               <w:bottom w:val="single" w:color="D9D4D1" w:sz="4"/>
               <w:right w:val="single" w:color="D9D4D1" w:sz="4"/>
             </w:tcBorders>
-            <w:shd w:fill="FFFFFF" w:color="auto" w:val="clear"/>
+            <w:shd w:fill="F7F5F4" w:color="auto" w:val="clear"/>
             <w:tcMar>
               <w:top w:type="dxa" w:w="80"/>
               <w:left w:type="dxa" w:w="120"/>
@@ -1302,7 +1381,7 @@
               <w:bottom w:val="single" w:color="D9D4D1" w:sz="4"/>
               <w:right w:val="single" w:color="D9D4D1" w:sz="4"/>
             </w:tcBorders>
-            <w:shd w:fill="F7F5F4" w:color="auto" w:val="clear"/>
+            <w:shd w:fill="FFFFFF" w:color="auto" w:val="clear"/>
             <w:tcMar>
               <w:top w:type="dxa" w:w="80"/>
               <w:left w:type="dxa" w:w="120"/>
@@ -1329,7 +1408,7 @@
               <w:bottom w:val="single" w:color="D9D4D1" w:sz="4"/>
               <w:right w:val="single" w:color="D9D4D1" w:sz="4"/>
             </w:tcBorders>
-            <w:shd w:fill="F7F5F4" w:color="auto" w:val="clear"/>
+            <w:shd w:fill="FFFFFF" w:color="auto" w:val="clear"/>
             <w:tcMar>
               <w:top w:type="dxa" w:w="80"/>
               <w:left w:type="dxa" w:w="120"/>
@@ -1368,7 +1447,7 @@
               <w:bottom w:val="single" w:color="D9D4D1" w:sz="4"/>
               <w:right w:val="single" w:color="D9D4D1" w:sz="4"/>
             </w:tcBorders>
-            <w:shd w:fill="FFFFFF" w:color="auto" w:val="clear"/>
+            <w:shd w:fill="F7F5F4" w:color="auto" w:val="clear"/>
             <w:tcMar>
               <w:top w:type="dxa" w:w="80"/>
               <w:left w:type="dxa" w:w="120"/>
@@ -1395,7 +1474,7 @@
               <w:bottom w:val="single" w:color="D9D4D1" w:sz="4"/>
               <w:right w:val="single" w:color="D9D4D1" w:sz="4"/>
             </w:tcBorders>
-            <w:shd w:fill="FFFFFF" w:color="auto" w:val="clear"/>
+            <w:shd w:fill="F7F5F4" w:color="auto" w:val="clear"/>
             <w:tcMar>
               <w:top w:type="dxa" w:w="80"/>
               <w:left w:type="dxa" w:w="120"/>
@@ -1827,7 +1906,7 @@
               <w:spacing w:after="40"/>
             </w:pPr>
             <w:r>
-              <w:t xml:space="preserve">Seulement mes tâches</w:t>
+              <w:t xml:space="preserve">Toutes les priorités</w:t>
             </w:r>
           </w:p>
         </w:tc>
@@ -1854,7 +1933,7 @@
               <w:spacing w:after="40"/>
             </w:pPr>
             <w:r>
-              <w:t xml:space="preserve">Masquer les tâches des collègues : il ne reste que les vôtres et les tâches communes à vos groupes.</w:t>
+              <w:t xml:space="preserve">N'afficher que les tâches 🔴 urgentes, 🟠 hautes, 🔵 normales ou ⚪ basses.</w:t>
             </w:r>
           </w:p>
         </w:tc>
@@ -1886,6 +1965,65 @@
               <w:spacing w:after="40"/>
             </w:pPr>
             <w:r>
+              <w:t xml:space="preserve">Seulement mes tâches</w:t>
+            </w:r>
+          </w:p>
+        </w:tc>
+        <w:tc>
+          <w:tcPr>
+            <w:tcW w:type="dxa" w:w="6638"/>
+            <w:tcBorders>
+              <w:top w:val="single" w:color="D9D4D1" w:sz="4"/>
+              <w:left w:val="single" w:color="D9D4D1" w:sz="4"/>
+              <w:bottom w:val="single" w:color="D9D4D1" w:sz="4"/>
+              <w:right w:val="single" w:color="D9D4D1" w:sz="4"/>
+            </w:tcBorders>
+            <w:shd w:fill="F7F5F4" w:color="auto" w:val="clear"/>
+            <w:tcMar>
+              <w:top w:type="dxa" w:w="80"/>
+              <w:left w:type="dxa" w:w="120"/>
+              <w:bottom w:type="dxa" w:w="80"/>
+              <w:right w:type="dxa" w:w="120"/>
+            </w:tcMar>
+            <w:vAlign w:val="center"/>
+          </w:tcPr>
+          <w:p>
+            <w:pPr>
+              <w:spacing w:after="40"/>
+            </w:pPr>
+            <w:r>
+              <w:t xml:space="preserve">Masquer les tâches des collègues : il ne reste que les vôtres et les tâches communes à vos groupes.</w:t>
+            </w:r>
+          </w:p>
+        </w:tc>
+      </w:tr>
+      <w:tr>
+        <w:trPr>
+          <w:cantSplit/>
+        </w:trPr>
+        <w:tc>
+          <w:tcPr>
+            <w:tcW w:type="dxa" w:w="3000"/>
+            <w:tcBorders>
+              <w:top w:val="single" w:color="D9D4D1" w:sz="4"/>
+              <w:left w:val="single" w:color="D9D4D1" w:sz="4"/>
+              <w:bottom w:val="single" w:color="D9D4D1" w:sz="4"/>
+              <w:right w:val="single" w:color="D9D4D1" w:sz="4"/>
+            </w:tcBorders>
+            <w:shd w:fill="FFFFFF" w:color="auto" w:val="clear"/>
+            <w:tcMar>
+              <w:top w:type="dxa" w:w="80"/>
+              <w:left w:type="dxa" w:w="120"/>
+              <w:bottom w:type="dxa" w:w="80"/>
+              <w:right w:type="dxa" w:w="120"/>
+            </w:tcMar>
+            <w:vAlign w:val="center"/>
+          </w:tcPr>
+          <w:p>
+            <w:pPr>
+              <w:spacing w:after="40"/>
+            </w:pPr>
+            <w:r>
               <w:t xml:space="preserve">Masquer les terminées</w:t>
             </w:r>
           </w:p>
@@ -1899,7 +2037,7 @@
               <w:bottom w:val="single" w:color="D9D4D1" w:sz="4"/>
               <w:right w:val="single" w:color="D9D4D1" w:sz="4"/>
             </w:tcBorders>
-            <w:shd w:fill="F7F5F4" w:color="auto" w:val="clear"/>
+            <w:shd w:fill="FFFFFF" w:color="auto" w:val="clear"/>
             <w:tcMar>
               <w:top w:type="dxa" w:w="80"/>
               <w:left w:type="dxa" w:w="120"/>
@@ -2079,6 +2217,34 @@
     </w:p>
     <w:p>
       <w:pPr>
+        <w:spacing w:after="120"/>
+      </w:pPr>
+      <w:r>
+        <w:t xml:space="preserve">Le bloc d'informations indique aussi la </w:t>
+      </w:r>
+      <w:r>
+        <w:rPr>
+          <w:b/>
+          <w:bCs/>
+        </w:rPr>
+        <w:t xml:space="preserve">priorité</w:t>
+      </w:r>
+      <w:r>
+        <w:t xml:space="preserve"> de la tâche et </w:t>
+      </w:r>
+      <w:r>
+        <w:rPr>
+          <w:b/>
+          <w:bCs/>
+        </w:rPr>
+        <w:t xml:space="preserve">qui l'a créée</w:t>
+      </w:r>
+      <w:r>
+        <w:t xml:space="preserve"> (avec la date et l'heure).</w:t>
+      </w:r>
+    </w:p>
+    <w:p>
+      <w:pPr>
         <w:pStyle w:val="Heading2"/>
       </w:pPr>
       <w:r>
@@ -2883,20 +3049,10 @@
           <w:b/>
           <w:bCs/>
         </w:rPr>
-        <w:t xml:space="preserve">Début</w:t>
-      </w:r>
-      <w:r>
-        <w:t xml:space="preserve"> et </w:t>
-      </w:r>
-      <w:r>
-        <w:rPr>
-          <w:b/>
-          <w:bCs/>
-        </w:rPr>
-        <w:t xml:space="preserve">Fin</w:t>
-      </w:r>
-      <w:r>
-        <w:t xml:space="preserve"> : les dates de la tâche (la fin sert aux alertes « J-n » et « en retard »).</w:t>
+        <w:t xml:space="preserve">Priorité</w:t>
+      </w:r>
+      <w:r>
+        <w:t xml:space="preserve"> : 🔴 Urgente, 🟠 Haute, 🔵 Normale (par défaut) ou ⚪ Basse.</w:t>
       </w:r>
     </w:p>
     <w:p>
@@ -2913,10 +3069,20 @@
           <w:b/>
           <w:bCs/>
         </w:rPr>
-        <w:t xml:space="preserve">Description</w:t>
-      </w:r>
-      <w:r>
-        <w:t xml:space="preserve"> : contexte, client, points d'attention.</w:t>
+        <w:t xml:space="preserve">Début</w:t>
+      </w:r>
+      <w:r>
+        <w:t xml:space="preserve"> et </w:t>
+      </w:r>
+      <w:r>
+        <w:rPr>
+          <w:b/>
+          <w:bCs/>
+        </w:rPr>
+        <w:t xml:space="preserve">Fin</w:t>
+      </w:r>
+      <w:r>
+        <w:t xml:space="preserve"> : les dates de la tâche (la fin sert aux alertes « J-n » et « en retard »).</w:t>
       </w:r>
     </w:p>
     <w:p>
@@ -2933,20 +3099,10 @@
           <w:b/>
           <w:bCs/>
         </w:rPr>
-        <w:t xml:space="preserve">Étapes</w:t>
-      </w:r>
-      <w:r>
-        <w:t xml:space="preserve"> : la liste de ce qu'il faut faire. </w:t>
-      </w:r>
-      <w:r>
-        <w:rPr>
-          <w:b/>
-          <w:bCs/>
-        </w:rPr>
-        <w:t xml:space="preserve">Ajouter une étape</w:t>
-      </w:r>
-      <w:r>
-        <w:t xml:space="preserve"> pour en ajouter ; les flèches ↑ ↓ changent l'ordre ; la corbeille retire une étape.</w:t>
+        <w:t xml:space="preserve">Description</w:t>
+      </w:r>
+      <w:r>
+        <w:t xml:space="preserve"> : contexte, client, points d'attention.</w:t>
       </w:r>
     </w:p>
     <w:p>
@@ -2959,6 +3115,36 @@
         <w:spacing w:after="100"/>
       </w:pPr>
       <w:r>
+        <w:rPr>
+          <w:b/>
+          <w:bCs/>
+        </w:rPr>
+        <w:t xml:space="preserve">Étapes</w:t>
+      </w:r>
+      <w:r>
+        <w:t xml:space="preserve"> : la liste de ce qu'il faut faire. </w:t>
+      </w:r>
+      <w:r>
+        <w:rPr>
+          <w:b/>
+          <w:bCs/>
+        </w:rPr>
+        <w:t xml:space="preserve">Ajouter une étape</w:t>
+      </w:r>
+      <w:r>
+        <w:t xml:space="preserve"> pour en ajouter ; les flèches ↑ ↓ changent l'ordre ; la corbeille retire une étape.</w:t>
+      </w:r>
+    </w:p>
+    <w:p>
+      <w:pPr>
+        <w:pStyle w:val="ListParagraph"/>
+        <w:numPr>
+          <w:ilvl w:val="0"/>
+          <w:numId w:val="4"/>
+        </w:numPr>
+        <w:spacing w:after="100"/>
+      </w:pPr>
+      <w:r>
         <w:t xml:space="preserve">Cliquez sur </w:t>
       </w:r>
       <w:r>
@@ -2991,7 +3177,7 @@
       <w:r>
         <w:drawing>
           <wp:inline distT="0" distB="0" distL="0" distR="0">
-            <wp:extent cx="4933950" cy="4762500"/>
+            <wp:extent cx="3876675" cy="4000500"/>
             <wp:effectExtent t="0" r="0" b="0" l="0"/>
             <wp:docPr id="1" name="06-nouvelle-tache.png" descr="Le formulaire de création d'une tâche." title="Le formulaire de création d'une tâche."/>
             <wp:cNvGraphicFramePr>
@@ -3016,7 +3202,7 @@
                   <pic:spPr bwMode="auto">
                     <a:xfrm>
                       <a:off x="0" y="0"/>
-                      <a:ext cx="4933950" cy="4762500"/>
+                      <a:ext cx="3876675" cy="4000500"/>
                     </a:xfrm>
                     <a:prstGeom prst="rect">
                       <a:avLst/>
@@ -3674,27 +3860,37 @@
         <w:spacing w:after="120"/>
       </w:pPr>
       <w:r>
-        <w:t xml:space="preserve">Dans la liste </w:t>
-      </w:r>
-      <w:r>
-        <w:rPr>
-          <w:b/>
-          <w:bCs/>
-        </w:rPr>
-        <w:t xml:space="preserve">Groupes existants</w:t>
-      </w:r>
-      <w:r>
-        <w:t xml:space="preserve">, les flèches </w:t>
-      </w:r>
-      <w:r>
-        <w:rPr>
-          <w:b/>
-          <w:bCs/>
-        </w:rPr>
-        <w:t xml:space="preserve">↑ ↓</w:t>
-      </w:r>
-      <w:r>
-        <w:t xml:space="preserve"> font monter ou descendre un groupe. Cet ordre s'applique à l'accueil et à la timeline de </w:t>
+        <w:t xml:space="preserve">Sur l'</w:t>
+      </w:r>
+      <w:r>
+        <w:rPr>
+          <w:b/>
+          <w:bCs/>
+        </w:rPr>
+        <w:t xml:space="preserve">accueil</w:t>
+      </w:r>
+      <w:r>
+        <w:t xml:space="preserve">, chaque carte de groupe a deux flèches </w:t>
+      </w:r>
+      <w:r>
+        <w:rPr>
+          <w:b/>
+          <w:bCs/>
+        </w:rPr>
+        <w:t xml:space="preserve">←</w:t>
+      </w:r>
+      <w:r>
+        <w:t xml:space="preserve"> et </w:t>
+      </w:r>
+      <w:r>
+        <w:rPr>
+          <w:b/>
+          <w:bCs/>
+        </w:rPr>
+        <w:t xml:space="preserve">→</w:t>
+      </w:r>
+      <w:r>
+        <w:t xml:space="preserve"> (« Placer avant » / « Placer après »). Un clic échange le groupe avec son voisin. L'ordre est le même pour </w:t>
       </w:r>
       <w:r>
         <w:rPr>
@@ -3702,6 +3898,16 @@
           <w:bCs/>
         </w:rPr>
         <w:t xml:space="preserve">tout le monde</w:t>
+      </w:r>
+      <w:r>
+        <w:t xml:space="preserve">, sur l'accueil comme sur la timeline. Les flèches disparaissent quand un filtre est actif (pour ne pas se tromper d'ordre) ; on peut aussi utiliser les flèches ↑ ↓ de la liste « Groupes existants » de l'onglet </w:t>
+      </w:r>
+      <w:r>
+        <w:rPr>
+          <w:b/>
+          <w:bCs/>
+        </w:rPr>
+        <w:t xml:space="preserve">+ Groupe</w:t>
       </w:r>
       <w:r>
         <w:t xml:space="preserve">.</w:t>
@@ -3716,9 +3922,9 @@
       <w:r>
         <w:drawing>
           <wp:inline distT="0" distB="0" distL="0" distR="0">
-            <wp:extent cx="4953000" cy="2819400"/>
+            <wp:extent cx="5334000" cy="2638425"/>
             <wp:effectExtent t="0" r="0" b="0" l="0"/>
-            <wp:docPr id="1" name="18-groupes-ordre.png" descr="Les flèches ↑ ↓ de l'administrateur, dans la liste des groupes." title="Les flèches ↑ ↓ de l'administrateur, dans la liste des groupes."/>
+            <wp:docPr id="1" name="18-groupes-ordre.png" descr="Les flèches ← → de l'administrateur sur chaque carte de groupe." title="Les flèches ← → de l'administrateur sur chaque carte de groupe."/>
             <wp:cNvGraphicFramePr>
               <a:graphicFrameLocks xmlns:a="http://schemas.openxmlformats.org/drawingml/2006/main" noChangeAspect="1"/>
             </wp:cNvGraphicFramePr>
@@ -3741,7 +3947,7 @@
                   <pic:spPr bwMode="auto">
                     <a:xfrm>
                       <a:off x="0" y="0"/>
-                      <a:ext cx="4953000" cy="2819400"/>
+                      <a:ext cx="5334000" cy="2638425"/>
                     </a:xfrm>
                     <a:prstGeom prst="rect">
                       <a:avLst/>
@@ -3767,7 +3973,7 @@
           <w:sz w:val="18"/>
           <w:szCs w:val="18"/>
         </w:rPr>
-        <w:t xml:space="preserve">Les flèches ↑ ↓ de l'administrateur, dans la liste des groupes.</w:t>
+        <w:t xml:space="preserve">Les flèches ← → de l'administrateur sur chaque carte de groupe.</w:t>
       </w:r>
     </w:p>
     <w:p>
@@ -3807,7 +4013,7 @@
       <w:r>
         <w:drawing>
           <wp:inline distT="0" distB="0" distL="0" distR="0">
-            <wp:extent cx="4162425" cy="4953000"/>
+            <wp:extent cx="3362325" cy="4000500"/>
             <wp:effectExtent t="0" r="0" b="0" l="0"/>
             <wp:docPr id="1" name="09-categories.png" descr="La page Catégories : création en haut, liste en bas." title="La page Catégories : création en haut, liste en bas."/>
             <wp:cNvGraphicFramePr>
@@ -3832,7 +4038,7 @@
                   <pic:spPr bwMode="auto">
                     <a:xfrm>
                       <a:off x="0" y="0"/>
-                      <a:ext cx="4162425" cy="4953000"/>
+                      <a:ext cx="3362325" cy="4000500"/>
                     </a:xfrm>
                     <a:prstGeom prst="rect">
                       <a:avLst/>
@@ -4348,7 +4554,7 @@
         <w:spacing w:after="100"/>
       </w:pPr>
       <w:r>
-        <w:t xml:space="preserve">Tapez votre mot de passe actuel, puis le nouveau (4 caractères minimum).</w:t>
+        <w:t xml:space="preserve">Tapez votre mot de passe actuel, puis le nouveau (6 caractères minimum, difficile à deviner).</w:t>
       </w:r>
     </w:p>
     <w:p>
@@ -4379,7 +4585,55 @@
         <w:pStyle w:val="Heading2"/>
       </w:pPr>
       <w:r>
-        <w:t xml:space="preserve">Affichage clair ou sombre</w:t>
+        <w:t xml:space="preserve">Adresse de connexion et QR code</w:t>
+      </w:r>
+    </w:p>
+    <w:p>
+      <w:pPr>
+        <w:spacing w:after="120"/>
+      </w:pPr>
+      <w:r>
+        <w:t xml:space="preserve">En haut de la page Compte, le bloc </w:t>
+      </w:r>
+      <w:r>
+        <w:rPr>
+          <w:b/>
+          <w:bCs/>
+        </w:rPr>
+        <w:t xml:space="preserve">Se connecter depuis un autre appareil</w:t>
+      </w:r>
+      <w:r>
+        <w:t xml:space="preserve"> affiche l'adresse du site et un </w:t>
+      </w:r>
+      <w:r>
+        <w:rPr>
+          <w:b/>
+          <w:bCs/>
+        </w:rPr>
+        <w:t xml:space="preserve">QR code</w:t>
+      </w:r>
+      <w:r>
+        <w:t xml:space="preserve">. Sur un téléphone ou une tablette, ouvrez l'appareil photo et visez le QR code : le site s'ouvre. Le bouton </w:t>
+      </w:r>
+      <w:r>
+        <w:rPr>
+          <w:b/>
+          <w:bCs/>
+        </w:rPr>
+        <w:t xml:space="preserve">Copier l'adresse</w:t>
+      </w:r>
+      <w:r>
+        <w:t xml:space="preserve"> la place dans le presse-papiers, et </w:t>
+      </w:r>
+      <w:r>
+        <w:rPr>
+          <w:b/>
+          <w:bCs/>
+        </w:rPr>
+        <w:t xml:space="preserve">Fiche à imprimer</w:t>
+      </w:r>
+      <w:r>
+        <w:t xml:space="preserve"> ouvre une page avec le QR code en grand, à imprimer et à afficher au bureau.</w:t>
       </w:r>
     </w:p>
     <w:p>
@@ -4391,9 +4645,9 @@
       <w:r>
         <w:drawing>
           <wp:inline distT="0" distB="0" distL="0" distR="0">
-            <wp:extent cx="4953000" cy="742950"/>
+            <wp:extent cx="4953000" cy="1495425"/>
             <wp:effectExtent t="0" r="0" b="0" l="0"/>
-            <wp:docPr id="1" name="15-affichage.png" descr="Choix de l'affichage : comme l'ordinateur, clair ou sombre." title="Choix de l'affichage : comme l'ordinateur, clair ou sombre."/>
+            <wp:docPr id="1" name="19-acces.png" descr="Compte → adresse du site et QR code à scanner." title="Compte → adresse du site et QR code à scanner."/>
             <wp:cNvGraphicFramePr>
               <a:graphicFrameLocks xmlns:a="http://schemas.openxmlformats.org/drawingml/2006/main" noChangeAspect="1"/>
             </wp:cNvGraphicFramePr>
@@ -4416,7 +4670,7 @@
                   <pic:spPr bwMode="auto">
                     <a:xfrm>
                       <a:off x="0" y="0"/>
-                      <a:ext cx="4953000" cy="742950"/>
+                      <a:ext cx="4953000" cy="1495425"/>
                     </a:xfrm>
                     <a:prstGeom prst="rect">
                       <a:avLst/>
@@ -4442,7 +4696,7 @@
           <w:sz w:val="18"/>
           <w:szCs w:val="18"/>
         </w:rPr>
-        <w:t xml:space="preserve">Choix de l'affichage : comme l'ordinateur, clair ou sombre.</w:t>
+        <w:t xml:space="preserve">Compte → adresse du site et QR code à scanner.</w:t>
       </w:r>
     </w:p>
     <w:p>
@@ -4450,7 +4704,7 @@
         <w:pStyle w:val="Heading2"/>
       </w:pPr>
       <w:r>
-        <w:t xml:space="preserve">Exporter vers Excel</w:t>
+        <w:t xml:space="preserve">Affichage clair ou sombre</w:t>
       </w:r>
     </w:p>
     <w:p>
@@ -4462,9 +4716,9 @@
       <w:r>
         <w:drawing>
           <wp:inline distT="0" distB="0" distL="0" distR="0">
-            <wp:extent cx="4953000" cy="923925"/>
+            <wp:extent cx="4953000" cy="742950"/>
             <wp:effectExtent t="0" r="0" b="0" l="0"/>
-            <wp:docPr id="1" name="14-donnees.png" descr="Le bouton d'export dans la partie « Données »." title="Le bouton d'export dans la partie « Données »."/>
+            <wp:docPr id="1" name="15-affichage.png" descr="Choix de l'affichage : comme l'ordinateur, clair ou sombre." title="Choix de l'affichage : comme l'ordinateur, clair ou sombre."/>
             <wp:cNvGraphicFramePr>
               <a:graphicFrameLocks xmlns:a="http://schemas.openxmlformats.org/drawingml/2006/main" noChangeAspect="1"/>
             </wp:cNvGraphicFramePr>
@@ -4487,7 +4741,7 @@
                   <pic:spPr bwMode="auto">
                     <a:xfrm>
                       <a:off x="0" y="0"/>
-                      <a:ext cx="4953000" cy="923925"/>
+                      <a:ext cx="4953000" cy="742950"/>
                     </a:xfrm>
                     <a:prstGeom prst="rect">
                       <a:avLst/>
@@ -4513,120 +4767,7 @@
           <w:sz w:val="18"/>
           <w:szCs w:val="18"/>
         </w:rPr>
-        <w:t xml:space="preserve">Le bouton d'export dans la partie « Données ».</w:t>
-      </w:r>
-    </w:p>
-    <w:p>
-      <w:pPr>
-        <w:spacing w:after="120"/>
-      </w:pPr>
-      <w:r>
-        <w:rPr>
-          <w:b/>
-          <w:bCs/>
-        </w:rPr>
-        <w:t xml:space="preserve">Exporter les tâches (Excel)</w:t>
-      </w:r>
-      <w:r>
-        <w:t xml:space="preserve"> télécharge un fichier avec les tâches que vous voyez : groupe, catégorie, titre, responsable, dates, avancement, statut. Il s'ouvre directement dans Excel.</w:t>
-      </w:r>
-    </w:p>
-    <w:tbl>
-      <w:tblPr>
-        <w:tblW w:type="dxa" w:w="9638"/>
-        <w:tblBorders>
-          <w:top w:val="single" w:color="auto" w:sz="4"/>
-          <w:left w:val="single" w:color="auto" w:sz="4"/>
-          <w:bottom w:val="single" w:color="auto" w:sz="4"/>
-          <w:right w:val="single" w:color="auto" w:sz="4"/>
-          <w:insideH w:val="single" w:color="auto" w:sz="4"/>
-          <w:insideV w:val="single" w:color="auto" w:sz="4"/>
-        </w:tblBorders>
-      </w:tblPr>
-      <w:tblGrid>
-        <w:gridCol w:w="9638"/>
-      </w:tblGrid>
-      <w:tr>
-        <w:trPr>
-          <w:cantSplit/>
-        </w:trPr>
-        <w:tc>
-          <w:tcPr>
-            <w:tcW w:type="dxa" w:w="9638"/>
-            <w:tcBorders>
-              <w:top w:val="none" w:color="FFFFFF" w:sz="0"/>
-              <w:left w:val="single" w:color="1D7A3F" w:sz="24"/>
-              <w:bottom w:val="none" w:color="FFFFFF" w:sz="0"/>
-              <w:right w:val="none" w:color="FFFFFF" w:sz="0"/>
-            </w:tcBorders>
-            <w:shd w:fill="E3F2E8" w:color="auto" w:val="clear"/>
-            <w:tcMar>
-              <w:top w:type="dxa" w:w="120"/>
-              <w:left w:type="dxa" w:w="200"/>
-              <w:bottom w:type="dxa" w:w="120"/>
-              <w:right w:type="dxa" w:w="200"/>
-            </w:tcMar>
-          </w:tcPr>
-          <w:p>
-            <w:pPr>
-              <w:spacing w:after="60"/>
-            </w:pPr>
-            <w:r>
-              <w:rPr>
-                <w:b/>
-                <w:bCs/>
-                <w:color w:val="1D7A3F"/>
-              </w:rPr>
-              <w:t xml:space="preserve">💡  Exporter une sélection</w:t>
-            </w:r>
-          </w:p>
-          <w:p>
-            <w:pPr>
-              <w:spacing w:after="40"/>
-            </w:pPr>
-            <w:r>
-              <w:t xml:space="preserve">L'export tient compte de la recherche et des filtres de l'accueil : filtrez d'abord (par exemple la catégorie « Devis »), puis exportez.</w:t>
-            </w:r>
-          </w:p>
-        </w:tc>
-      </w:tr>
-    </w:tbl>
-    <w:p>
-      <w:pPr>
-        <w:pStyle w:val="Heading1"/>
-        <w:keepNext/>
-        <w:pageBreakBefore/>
-      </w:pPr>
-      <w:r>
-        <w:t xml:space="preserve">10. Utiliser Claude ou ChatGPT</w:t>
-      </w:r>
-    </w:p>
-    <w:p>
-      <w:pPr>
-        <w:spacing w:after="120"/>
-      </w:pPr>
-      <w:r>
-        <w:t xml:space="preserve">Si </w:t>
-      </w:r>
-      <w:r>
-        <w:rPr>
-          <w:b/>
-          <w:bCs/>
-        </w:rPr>
-        <w:t xml:space="preserve">Claude</w:t>
-      </w:r>
-      <w:r>
-        <w:t xml:space="preserve"> (application pour ordinateur) ou </w:t>
-      </w:r>
-      <w:r>
-        <w:rPr>
-          <w:b/>
-          <w:bCs/>
-        </w:rPr>
-        <w:t xml:space="preserve">ChatGPT</w:t>
-      </w:r>
-      <w:r>
-        <w:t xml:space="preserve"> a été relié à votre compte (voir le guide d'installation, chapitres 11 et 12), vous pouvez lui parler de vos tâches en français. Les demandes et les possibilités sont les mêmes avec les deux assistants.</w:t>
+        <w:t xml:space="preserve">Choix de l'affichage : comme l'ordinateur, clair ou sombre.</w:t>
       </w:r>
     </w:p>
     <w:p>
@@ -4634,796 +4775,7 @@
         <w:pStyle w:val="Heading2"/>
       </w:pPr>
       <w:r>
-        <w:t xml:space="preserve">Exemples de demandes</w:t>
-      </w:r>
-    </w:p>
-    <w:tbl>
-      <w:tblPr>
-        <w:tblW w:type="dxa" w:w="9638"/>
-        <w:tblBorders>
-          <w:top w:val="single" w:color="auto" w:sz="4"/>
-          <w:left w:val="single" w:color="auto" w:sz="4"/>
-          <w:bottom w:val="single" w:color="auto" w:sz="4"/>
-          <w:right w:val="single" w:color="auto" w:sz="4"/>
-          <w:insideH w:val="single" w:color="auto" w:sz="4"/>
-          <w:insideV w:val="single" w:color="auto" w:sz="4"/>
-        </w:tblBorders>
-      </w:tblPr>
-      <w:tblGrid>
-        <w:gridCol w:w="5400"/>
-        <w:gridCol w:w="4238"/>
-      </w:tblGrid>
-      <w:tr>
-        <w:trPr>
-          <w:cantSplit/>
-        </w:trPr>
-        <w:tc>
-          <w:tcPr>
-            <w:tcW w:type="dxa" w:w="5400"/>
-            <w:tcBorders>
-              <w:top w:val="single" w:color="D9D4D1" w:sz="4"/>
-              <w:left w:val="single" w:color="D9D4D1" w:sz="4"/>
-              <w:bottom w:val="single" w:color="D9D4D1" w:sz="4"/>
-              <w:right w:val="single" w:color="D9D4D1" w:sz="4"/>
-            </w:tcBorders>
-            <w:shd w:fill="C4122F" w:color="auto" w:val="clear"/>
-            <w:tcMar>
-              <w:top w:type="dxa" w:w="80"/>
-              <w:left w:type="dxa" w:w="120"/>
-              <w:bottom w:type="dxa" w:w="80"/>
-              <w:right w:type="dxa" w:w="120"/>
-            </w:tcMar>
-            <w:vAlign w:val="center"/>
-          </w:tcPr>
-          <w:p>
-            <w:pPr>
-              <w:spacing w:after="40"/>
-            </w:pPr>
-            <w:r>
-              <w:rPr>
-                <w:b/>
-                <w:bCs/>
-                <w:color w:val="FFFFFF"/>
-              </w:rPr>
-              <w:t xml:space="preserve">Vous écrivez…</w:t>
-            </w:r>
-          </w:p>
-        </w:tc>
-        <w:tc>
-          <w:tcPr>
-            <w:tcW w:type="dxa" w:w="4238"/>
-            <w:tcBorders>
-              <w:top w:val="single" w:color="D9D4D1" w:sz="4"/>
-              <w:left w:val="single" w:color="D9D4D1" w:sz="4"/>
-              <w:bottom w:val="single" w:color="D9D4D1" w:sz="4"/>
-              <w:right w:val="single" w:color="D9D4D1" w:sz="4"/>
-            </w:tcBorders>
-            <w:shd w:fill="C4122F" w:color="auto" w:val="clear"/>
-            <w:tcMar>
-              <w:top w:type="dxa" w:w="80"/>
-              <w:left w:type="dxa" w:w="120"/>
-              <w:bottom w:type="dxa" w:w="80"/>
-              <w:right w:type="dxa" w:w="120"/>
-            </w:tcMar>
-            <w:vAlign w:val="center"/>
-          </w:tcPr>
-          <w:p>
-            <w:pPr>
-              <w:spacing w:after="40"/>
-            </w:pPr>
-            <w:r>
-              <w:rPr>
-                <w:b/>
-                <w:bCs/>
-                <w:color w:val="FFFFFF"/>
-              </w:rPr>
-              <w:t xml:space="preserve">Claude…</w:t>
-            </w:r>
-          </w:p>
-        </w:tc>
-      </w:tr>
-      <w:tr>
-        <w:trPr>
-          <w:cantSplit/>
-        </w:trPr>
-        <w:tc>
-          <w:tcPr>
-            <w:tcW w:type="dxa" w:w="5400"/>
-            <w:tcBorders>
-              <w:top w:val="single" w:color="D9D4D1" w:sz="4"/>
-              <w:left w:val="single" w:color="D9D4D1" w:sz="4"/>
-              <w:bottom w:val="single" w:color="D9D4D1" w:sz="4"/>
-              <w:right w:val="single" w:color="D9D4D1" w:sz="4"/>
-            </w:tcBorders>
-            <w:shd w:fill="FFFFFF" w:color="auto" w:val="clear"/>
-            <w:tcMar>
-              <w:top w:type="dxa" w:w="80"/>
-              <w:left w:type="dxa" w:w="120"/>
-              <w:bottom w:type="dxa" w:w="80"/>
-              <w:right w:type="dxa" w:w="120"/>
-            </w:tcMar>
-            <w:vAlign w:val="center"/>
-          </w:tcPr>
-          <w:p>
-            <w:pPr>
-              <w:spacing w:after="40"/>
-            </w:pPr>
-            <w:r>
-              <w:t xml:space="preserve">« Qu'est-ce qui est en retard ? Résume-moi la semaine. »</w:t>
-            </w:r>
-          </w:p>
-        </w:tc>
-        <w:tc>
-          <w:tcPr>
-            <w:tcW w:type="dxa" w:w="4238"/>
-            <w:tcBorders>
-              <w:top w:val="single" w:color="D9D4D1" w:sz="4"/>
-              <w:left w:val="single" w:color="D9D4D1" w:sz="4"/>
-              <w:bottom w:val="single" w:color="D9D4D1" w:sz="4"/>
-              <w:right w:val="single" w:color="D9D4D1" w:sz="4"/>
-            </w:tcBorders>
-            <w:shd w:fill="FFFFFF" w:color="auto" w:val="clear"/>
-            <w:tcMar>
-              <w:top w:type="dxa" w:w="80"/>
-              <w:left w:type="dxa" w:w="120"/>
-              <w:bottom w:type="dxa" w:w="80"/>
-              <w:right w:type="dxa" w:w="120"/>
-            </w:tcMar>
-            <w:vAlign w:val="center"/>
-          </w:tcPr>
-          <w:p>
-            <w:pPr>
-              <w:spacing w:after="40"/>
-            </w:pPr>
-            <w:r>
-              <w:t xml:space="preserve">liste les tâches en retard et les échéances des 7 prochains jours.</w:t>
-            </w:r>
-          </w:p>
-        </w:tc>
-      </w:tr>
-      <w:tr>
-        <w:trPr>
-          <w:cantSplit/>
-        </w:trPr>
-        <w:tc>
-          <w:tcPr>
-            <w:tcW w:type="dxa" w:w="5400"/>
-            <w:tcBorders>
-              <w:top w:val="single" w:color="D9D4D1" w:sz="4"/>
-              <w:left w:val="single" w:color="D9D4D1" w:sz="4"/>
-              <w:bottom w:val="single" w:color="D9D4D1" w:sz="4"/>
-              <w:right w:val="single" w:color="D9D4D1" w:sz="4"/>
-            </w:tcBorders>
-            <w:shd w:fill="F7F5F4" w:color="auto" w:val="clear"/>
-            <w:tcMar>
-              <w:top w:type="dxa" w:w="80"/>
-              <w:left w:type="dxa" w:w="120"/>
-              <w:bottom w:type="dxa" w:w="80"/>
-              <w:right w:type="dxa" w:w="120"/>
-            </w:tcMar>
-            <w:vAlign w:val="center"/>
-          </w:tcPr>
-          <w:p>
-            <w:pPr>
-              <w:spacing w:after="40"/>
-            </w:pPr>
-            <w:r>
-              <w:t xml:space="preserve">« Crée un devis pour l'élevage Martin dans Le Roy, pour Claire, à rendre le 15/11, avec les étapes visite, chiffrage, envoi. »</w:t>
-            </w:r>
-          </w:p>
-        </w:tc>
-        <w:tc>
-          <w:tcPr>
-            <w:tcW w:type="dxa" w:w="4238"/>
-            <w:tcBorders>
-              <w:top w:val="single" w:color="D9D4D1" w:sz="4"/>
-              <w:left w:val="single" w:color="D9D4D1" w:sz="4"/>
-              <w:bottom w:val="single" w:color="D9D4D1" w:sz="4"/>
-              <w:right w:val="single" w:color="D9D4D1" w:sz="4"/>
-            </w:tcBorders>
-            <w:shd w:fill="F7F5F4" w:color="auto" w:val="clear"/>
-            <w:tcMar>
-              <w:top w:type="dxa" w:w="80"/>
-              <w:left w:type="dxa" w:w="120"/>
-              <w:bottom w:type="dxa" w:w="80"/>
-              <w:right w:type="dxa" w:w="120"/>
-            </w:tcMar>
-            <w:vAlign w:val="center"/>
-          </w:tcPr>
-          <w:p>
-            <w:pPr>
-              <w:spacing w:after="40"/>
-            </w:pPr>
-            <w:r>
-              <w:t xml:space="preserve">crée la tâche avec ses étapes.</w:t>
-            </w:r>
-          </w:p>
-        </w:tc>
-      </w:tr>
-      <w:tr>
-        <w:trPr>
-          <w:cantSplit/>
-        </w:trPr>
-        <w:tc>
-          <w:tcPr>
-            <w:tcW w:type="dxa" w:w="5400"/>
-            <w:tcBorders>
-              <w:top w:val="single" w:color="D9D4D1" w:sz="4"/>
-              <w:left w:val="single" w:color="D9D4D1" w:sz="4"/>
-              <w:bottom w:val="single" w:color="D9D4D1" w:sz="4"/>
-              <w:right w:val="single" w:color="D9D4D1" w:sz="4"/>
-            </w:tcBorders>
-            <w:shd w:fill="FFFFFF" w:color="auto" w:val="clear"/>
-            <w:tcMar>
-              <w:top w:type="dxa" w:w="80"/>
-              <w:left w:type="dxa" w:w="120"/>
-              <w:bottom w:type="dxa" w:w="80"/>
-              <w:right w:type="dxa" w:w="120"/>
-            </w:tcMar>
-            <w:vAlign w:val="center"/>
-          </w:tcPr>
-          <w:p>
-            <w:pPr>
-              <w:spacing w:after="40"/>
-            </w:pPr>
-            <w:r>
-              <w:t xml:space="preserve">« Coche l'étape chiffrage du devis Martin et ajoute un commentaire : client rappelé. »</w:t>
-            </w:r>
-          </w:p>
-        </w:tc>
-        <w:tc>
-          <w:tcPr>
-            <w:tcW w:type="dxa" w:w="4238"/>
-            <w:tcBorders>
-              <w:top w:val="single" w:color="D9D4D1" w:sz="4"/>
-              <w:left w:val="single" w:color="D9D4D1" w:sz="4"/>
-              <w:bottom w:val="single" w:color="D9D4D1" w:sz="4"/>
-              <w:right w:val="single" w:color="D9D4D1" w:sz="4"/>
-            </w:tcBorders>
-            <w:shd w:fill="FFFFFF" w:color="auto" w:val="clear"/>
-            <w:tcMar>
-              <w:top w:type="dxa" w:w="80"/>
-              <w:left w:type="dxa" w:w="120"/>
-              <w:bottom w:type="dxa" w:w="80"/>
-              <w:right w:type="dxa" w:w="120"/>
-            </w:tcMar>
-            <w:vAlign w:val="center"/>
-          </w:tcPr>
-          <w:p>
-            <w:pPr>
-              <w:spacing w:after="40"/>
-            </w:pPr>
-            <w:r>
-              <w:t xml:space="preserve">coche l'étape et ajoute le commentaire.</w:t>
-            </w:r>
-          </w:p>
-        </w:tc>
-      </w:tr>
-      <w:tr>
-        <w:trPr>
-          <w:cantSplit/>
-        </w:trPr>
-        <w:tc>
-          <w:tcPr>
-            <w:tcW w:type="dxa" w:w="5400"/>
-            <w:tcBorders>
-              <w:top w:val="single" w:color="D9D4D1" w:sz="4"/>
-              <w:left w:val="single" w:color="D9D4D1" w:sz="4"/>
-              <w:bottom w:val="single" w:color="D9D4D1" w:sz="4"/>
-              <w:right w:val="single" w:color="D9D4D1" w:sz="4"/>
-            </w:tcBorders>
-            <w:shd w:fill="F7F5F4" w:color="auto" w:val="clear"/>
-            <w:tcMar>
-              <w:top w:type="dxa" w:w="80"/>
-              <w:left w:type="dxa" w:w="120"/>
-              <w:bottom w:type="dxa" w:w="80"/>
-              <w:right w:type="dxa" w:w="120"/>
-            </w:tcMar>
-            <w:vAlign w:val="center"/>
-          </w:tcPr>
-          <w:p>
-            <w:pPr>
-              <w:spacing w:after="40"/>
-            </w:pPr>
-            <w:r>
-              <w:t xml:space="preserve">« Quelles tâches de Julien finissent ce mois-ci ? »</w:t>
-            </w:r>
-          </w:p>
-        </w:tc>
-        <w:tc>
-          <w:tcPr>
-            <w:tcW w:type="dxa" w:w="4238"/>
-            <w:tcBorders>
-              <w:top w:val="single" w:color="D9D4D1" w:sz="4"/>
-              <w:left w:val="single" w:color="D9D4D1" w:sz="4"/>
-              <w:bottom w:val="single" w:color="D9D4D1" w:sz="4"/>
-              <w:right w:val="single" w:color="D9D4D1" w:sz="4"/>
-            </w:tcBorders>
-            <w:shd w:fill="F7F5F4" w:color="auto" w:val="clear"/>
-            <w:tcMar>
-              <w:top w:type="dxa" w:w="80"/>
-              <w:left w:type="dxa" w:w="120"/>
-              <w:bottom w:type="dxa" w:w="80"/>
-              <w:right w:type="dxa" w:w="120"/>
-            </w:tcMar>
-            <w:vAlign w:val="center"/>
-          </w:tcPr>
-          <w:p>
-            <w:pPr>
-              <w:spacing w:after="40"/>
-            </w:pPr>
-            <w:r>
-              <w:t xml:space="preserve">filtre par personne et par date.</w:t>
-            </w:r>
-          </w:p>
-        </w:tc>
-      </w:tr>
-      <w:tr>
-        <w:trPr>
-          <w:cantSplit/>
-        </w:trPr>
-        <w:tc>
-          <w:tcPr>
-            <w:tcW w:type="dxa" w:w="5400"/>
-            <w:tcBorders>
-              <w:top w:val="single" w:color="D9D4D1" w:sz="4"/>
-              <w:left w:val="single" w:color="D9D4D1" w:sz="4"/>
-              <w:bottom w:val="single" w:color="D9D4D1" w:sz="4"/>
-              <w:right w:val="single" w:color="D9D4D1" w:sz="4"/>
-            </w:tcBorders>
-            <w:shd w:fill="FFFFFF" w:color="auto" w:val="clear"/>
-            <w:tcMar>
-              <w:top w:type="dxa" w:w="80"/>
-              <w:left w:type="dxa" w:w="120"/>
-              <w:bottom w:type="dxa" w:w="80"/>
-              <w:right w:type="dxa" w:w="120"/>
-            </w:tcMar>
-            <w:vAlign w:val="center"/>
-          </w:tcPr>
-          <w:p>
-            <w:pPr>
-              <w:spacing w:after="40"/>
-            </w:pPr>
-            <w:r>
-              <w:t xml:space="preserve">« Repousse la fin du chantier ventilation au 30 novembre. »</w:t>
-            </w:r>
-          </w:p>
-        </w:tc>
-        <w:tc>
-          <w:tcPr>
-            <w:tcW w:type="dxa" w:w="4238"/>
-            <w:tcBorders>
-              <w:top w:val="single" w:color="D9D4D1" w:sz="4"/>
-              <w:left w:val="single" w:color="D9D4D1" w:sz="4"/>
-              <w:bottom w:val="single" w:color="D9D4D1" w:sz="4"/>
-              <w:right w:val="single" w:color="D9D4D1" w:sz="4"/>
-            </w:tcBorders>
-            <w:shd w:fill="FFFFFF" w:color="auto" w:val="clear"/>
-            <w:tcMar>
-              <w:top w:type="dxa" w:w="80"/>
-              <w:left w:type="dxa" w:w="120"/>
-              <w:bottom w:type="dxa" w:w="80"/>
-              <w:right w:type="dxa" w:w="120"/>
-            </w:tcMar>
-            <w:vAlign w:val="center"/>
-          </w:tcPr>
-          <w:p>
-            <w:pPr>
-              <w:spacing w:after="40"/>
-            </w:pPr>
-            <w:r>
-              <w:t xml:space="preserve">modifie la date de fin.</w:t>
-            </w:r>
-          </w:p>
-        </w:tc>
-      </w:tr>
-    </w:tbl>
-    <w:p>
-      <w:pPr>
-        <w:pStyle w:val="Heading2"/>
-      </w:pPr>
-      <w:r>
-        <w:t xml:space="preserve">Claude ou ChatGPT : les différences</w:t>
-      </w:r>
-    </w:p>
-    <w:tbl>
-      <w:tblPr>
-        <w:tblW w:type="dxa" w:w="9638"/>
-        <w:tblBorders>
-          <w:top w:val="single" w:color="auto" w:sz="4"/>
-          <w:left w:val="single" w:color="auto" w:sz="4"/>
-          <w:bottom w:val="single" w:color="auto" w:sz="4"/>
-          <w:right w:val="single" w:color="auto" w:sz="4"/>
-          <w:insideH w:val="single" w:color="auto" w:sz="4"/>
-          <w:insideV w:val="single" w:color="auto" w:sz="4"/>
-        </w:tblBorders>
-      </w:tblPr>
-      <w:tblGrid>
-        <w:gridCol w:w="2000"/>
-        <w:gridCol w:w="3819"/>
-        <w:gridCol w:w="3819"/>
-      </w:tblGrid>
-      <w:tr>
-        <w:trPr>
-          <w:cantSplit/>
-        </w:trPr>
-        <w:tc>
-          <w:tcPr>
-            <w:tcW w:type="dxa" w:w="2000"/>
-            <w:tcBorders>
-              <w:top w:val="single" w:color="D9D4D1" w:sz="4"/>
-              <w:left w:val="single" w:color="D9D4D1" w:sz="4"/>
-              <w:bottom w:val="single" w:color="D9D4D1" w:sz="4"/>
-              <w:right w:val="single" w:color="D9D4D1" w:sz="4"/>
-            </w:tcBorders>
-            <w:shd w:fill="C4122F" w:color="auto" w:val="clear"/>
-            <w:tcMar>
-              <w:top w:type="dxa" w:w="80"/>
-              <w:left w:type="dxa" w:w="120"/>
-              <w:bottom w:type="dxa" w:w="80"/>
-              <w:right w:type="dxa" w:w="120"/>
-            </w:tcMar>
-            <w:vAlign w:val="center"/>
-          </w:tcPr>
-          <w:p>
-            <w:pPr>
-              <w:spacing w:after="40"/>
-            </w:pPr>
-          </w:p>
-        </w:tc>
-        <w:tc>
-          <w:tcPr>
-            <w:tcW w:type="dxa" w:w="3819"/>
-            <w:tcBorders>
-              <w:top w:val="single" w:color="D9D4D1" w:sz="4"/>
-              <w:left w:val="single" w:color="D9D4D1" w:sz="4"/>
-              <w:bottom w:val="single" w:color="D9D4D1" w:sz="4"/>
-              <w:right w:val="single" w:color="D9D4D1" w:sz="4"/>
-            </w:tcBorders>
-            <w:shd w:fill="C4122F" w:color="auto" w:val="clear"/>
-            <w:tcMar>
-              <w:top w:type="dxa" w:w="80"/>
-              <w:left w:type="dxa" w:w="120"/>
-              <w:bottom w:type="dxa" w:w="80"/>
-              <w:right w:type="dxa" w:w="120"/>
-            </w:tcMar>
-            <w:vAlign w:val="center"/>
-          </w:tcPr>
-          <w:p>
-            <w:pPr>
-              <w:spacing w:after="40"/>
-            </w:pPr>
-            <w:r>
-              <w:rPr>
-                <w:b/>
-                <w:bCs/>
-                <w:color w:val="FFFFFF"/>
-              </w:rPr>
-              <w:t xml:space="preserve">Claude</w:t>
-            </w:r>
-          </w:p>
-        </w:tc>
-        <w:tc>
-          <w:tcPr>
-            <w:tcW w:type="dxa" w:w="3819"/>
-            <w:tcBorders>
-              <w:top w:val="single" w:color="D9D4D1" w:sz="4"/>
-              <w:left w:val="single" w:color="D9D4D1" w:sz="4"/>
-              <w:bottom w:val="single" w:color="D9D4D1" w:sz="4"/>
-              <w:right w:val="single" w:color="D9D4D1" w:sz="4"/>
-            </w:tcBorders>
-            <w:shd w:fill="C4122F" w:color="auto" w:val="clear"/>
-            <w:tcMar>
-              <w:top w:type="dxa" w:w="80"/>
-              <w:left w:type="dxa" w:w="120"/>
-              <w:bottom w:type="dxa" w:w="80"/>
-              <w:right w:type="dxa" w:w="120"/>
-            </w:tcMar>
-            <w:vAlign w:val="center"/>
-          </w:tcPr>
-          <w:p>
-            <w:pPr>
-              <w:spacing w:after="40"/>
-            </w:pPr>
-            <w:r>
-              <w:rPr>
-                <w:b/>
-                <w:bCs/>
-                <w:color w:val="FFFFFF"/>
-              </w:rPr>
-              <w:t xml:space="preserve">ChatGPT</w:t>
-            </w:r>
-          </w:p>
-        </w:tc>
-      </w:tr>
-      <w:tr>
-        <w:trPr>
-          <w:cantSplit/>
-        </w:trPr>
-        <w:tc>
-          <w:tcPr>
-            <w:tcW w:type="dxa" w:w="2000"/>
-            <w:tcBorders>
-              <w:top w:val="single" w:color="D9D4D1" w:sz="4"/>
-              <w:left w:val="single" w:color="D9D4D1" w:sz="4"/>
-              <w:bottom w:val="single" w:color="D9D4D1" w:sz="4"/>
-              <w:right w:val="single" w:color="D9D4D1" w:sz="4"/>
-            </w:tcBorders>
-            <w:shd w:fill="FFFFFF" w:color="auto" w:val="clear"/>
-            <w:tcMar>
-              <w:top w:type="dxa" w:w="80"/>
-              <w:left w:type="dxa" w:w="120"/>
-              <w:bottom w:type="dxa" w:w="80"/>
-              <w:right w:type="dxa" w:w="120"/>
-            </w:tcMar>
-            <w:vAlign w:val="center"/>
-          </w:tcPr>
-          <w:p>
-            <w:pPr>
-              <w:spacing w:after="40"/>
-            </w:pPr>
-            <w:r>
-              <w:t xml:space="preserve">Où l'utiliser</w:t>
-            </w:r>
-          </w:p>
-        </w:tc>
-        <w:tc>
-          <w:tcPr>
-            <w:tcW w:type="dxa" w:w="3819"/>
-            <w:tcBorders>
-              <w:top w:val="single" w:color="D9D4D1" w:sz="4"/>
-              <w:left w:val="single" w:color="D9D4D1" w:sz="4"/>
-              <w:bottom w:val="single" w:color="D9D4D1" w:sz="4"/>
-              <w:right w:val="single" w:color="D9D4D1" w:sz="4"/>
-            </w:tcBorders>
-            <w:shd w:fill="FFFFFF" w:color="auto" w:val="clear"/>
-            <w:tcMar>
-              <w:top w:type="dxa" w:w="80"/>
-              <w:left w:type="dxa" w:w="120"/>
-              <w:bottom w:type="dxa" w:w="80"/>
-              <w:right w:type="dxa" w:w="120"/>
-            </w:tcMar>
-            <w:vAlign w:val="center"/>
-          </w:tcPr>
-          <w:p>
-            <w:pPr>
-              <w:spacing w:after="40"/>
-            </w:pPr>
-            <w:r>
-              <w:t xml:space="preserve">Application Claude pour ordinateur, sur un PC du bureau</w:t>
-            </w:r>
-          </w:p>
-        </w:tc>
-        <w:tc>
-          <w:tcPr>
-            <w:tcW w:type="dxa" w:w="3819"/>
-            <w:tcBorders>
-              <w:top w:val="single" w:color="D9D4D1" w:sz="4"/>
-              <w:left w:val="single" w:color="D9D4D1" w:sz="4"/>
-              <w:bottom w:val="single" w:color="D9D4D1" w:sz="4"/>
-              <w:right w:val="single" w:color="D9D4D1" w:sz="4"/>
-            </w:tcBorders>
-            <w:shd w:fill="FFFFFF" w:color="auto" w:val="clear"/>
-            <w:tcMar>
-              <w:top w:type="dxa" w:w="80"/>
-              <w:left w:type="dxa" w:w="120"/>
-              <w:bottom w:type="dxa" w:w="80"/>
-              <w:right w:type="dxa" w:w="120"/>
-            </w:tcMar>
-            <w:vAlign w:val="center"/>
-          </w:tcPr>
-          <w:p>
-            <w:pPr>
-              <w:spacing w:after="40"/>
-            </w:pPr>
-            <w:r>
-              <w:t xml:space="preserve">ChatGPT (site ou application), avec le mode développeur</w:t>
-            </w:r>
-          </w:p>
-        </w:tc>
-      </w:tr>
-      <w:tr>
-        <w:trPr>
-          <w:cantSplit/>
-        </w:trPr>
-        <w:tc>
-          <w:tcPr>
-            <w:tcW w:type="dxa" w:w="2000"/>
-            <w:tcBorders>
-              <w:top w:val="single" w:color="D9D4D1" w:sz="4"/>
-              <w:left w:val="single" w:color="D9D4D1" w:sz="4"/>
-              <w:bottom w:val="single" w:color="D9D4D1" w:sz="4"/>
-              <w:right w:val="single" w:color="D9D4D1" w:sz="4"/>
-            </w:tcBorders>
-            <w:shd w:fill="F7F5F4" w:color="auto" w:val="clear"/>
-            <w:tcMar>
-              <w:top w:type="dxa" w:w="80"/>
-              <w:left w:type="dxa" w:w="120"/>
-              <w:bottom w:type="dxa" w:w="80"/>
-              <w:right w:type="dxa" w:w="120"/>
-            </w:tcMar>
-            <w:vAlign w:val="center"/>
-          </w:tcPr>
-          <w:p>
-            <w:pPr>
-              <w:spacing w:after="40"/>
-            </w:pPr>
-            <w:r>
-              <w:t xml:space="preserve">Ce qu'il faut</w:t>
-            </w:r>
-          </w:p>
-        </w:tc>
-        <w:tc>
-          <w:tcPr>
-            <w:tcW w:type="dxa" w:w="3819"/>
-            <w:tcBorders>
-              <w:top w:val="single" w:color="D9D4D1" w:sz="4"/>
-              <w:left w:val="single" w:color="D9D4D1" w:sz="4"/>
-              <w:bottom w:val="single" w:color="D9D4D1" w:sz="4"/>
-              <w:right w:val="single" w:color="D9D4D1" w:sz="4"/>
-            </w:tcBorders>
-            <w:shd w:fill="F7F5F4" w:color="auto" w:val="clear"/>
-            <w:tcMar>
-              <w:top w:type="dxa" w:w="80"/>
-              <w:left w:type="dxa" w:w="120"/>
-              <w:bottom w:type="dxa" w:w="80"/>
-              <w:right w:type="dxa" w:w="120"/>
-            </w:tcMar>
-            <w:vAlign w:val="center"/>
-          </w:tcPr>
-          <w:p>
-            <w:pPr>
-              <w:spacing w:after="40"/>
-            </w:pPr>
-            <w:r>
-              <w:t xml:space="preserve">Lancer une fois </w:t>
-            </w:r>
-            <w:r>
-              <w:rPr>
-                <w:rFonts w:ascii="Consolas" w:cs="Consolas" w:eastAsia="Consolas" w:hAnsi="Consolas"/>
-                <w:color w:val="3D3A39"/>
-                <w:sz w:val="20"/>
-                <w:szCs w:val="20"/>
-                <w:shd w:fill="EDEAE8" w:color="auto" w:val="clear"/>
-              </w:rPr>
-              <w:t xml:space="preserve">lier-a-claude.bat</w:t>
-            </w:r>
-          </w:p>
-        </w:tc>
-        <w:tc>
-          <w:tcPr>
-            <w:tcW w:type="dxa" w:w="3819"/>
-            <w:tcBorders>
-              <w:top w:val="single" w:color="D9D4D1" w:sz="4"/>
-              <w:left w:val="single" w:color="D9D4D1" w:sz="4"/>
-              <w:bottom w:val="single" w:color="D9D4D1" w:sz="4"/>
-              <w:right w:val="single" w:color="D9D4D1" w:sz="4"/>
-            </w:tcBorders>
-            <w:shd w:fill="F7F5F4" w:color="auto" w:val="clear"/>
-            <w:tcMar>
-              <w:top w:type="dxa" w:w="80"/>
-              <w:left w:type="dxa" w:w="120"/>
-              <w:bottom w:type="dxa" w:w="80"/>
-              <w:right w:type="dxa" w:w="120"/>
-            </w:tcMar>
-            <w:vAlign w:val="center"/>
-          </w:tcPr>
-          <w:p>
-            <w:pPr>
-              <w:spacing w:after="40"/>
-            </w:pPr>
-            <w:r>
-              <w:t xml:space="preserve">Connecteur activé par l'administrateur, et la fenêtre </w:t>
-            </w:r>
-            <w:r>
-              <w:rPr>
-                <w:rFonts w:ascii="Consolas" w:cs="Consolas" w:eastAsia="Consolas" w:hAnsi="Consolas"/>
-                <w:color w:val="3D3A39"/>
-                <w:sz w:val="20"/>
-                <w:szCs w:val="20"/>
-                <w:shd w:fill="EDEAE8" w:color="auto" w:val="clear"/>
-              </w:rPr>
-              <w:t xml:space="preserve">ouvrir-pour-chatgpt.bat</w:t>
-            </w:r>
-            <w:r>
-              <w:t xml:space="preserve"> ouverte sur le PC serveur</w:t>
-            </w:r>
-          </w:p>
-        </w:tc>
-      </w:tr>
-      <w:tr>
-        <w:trPr>
-          <w:cantSplit/>
-        </w:trPr>
-        <w:tc>
-          <w:tcPr>
-            <w:tcW w:type="dxa" w:w="2000"/>
-            <w:tcBorders>
-              <w:top w:val="single" w:color="D9D4D1" w:sz="4"/>
-              <w:left w:val="single" w:color="D9D4D1" w:sz="4"/>
-              <w:bottom w:val="single" w:color="D9D4D1" w:sz="4"/>
-              <w:right w:val="single" w:color="D9D4D1" w:sz="4"/>
-            </w:tcBorders>
-            <w:shd w:fill="FFFFFF" w:color="auto" w:val="clear"/>
-            <w:tcMar>
-              <w:top w:type="dxa" w:w="80"/>
-              <w:left w:type="dxa" w:w="120"/>
-              <w:bottom w:type="dxa" w:w="80"/>
-              <w:right w:type="dxa" w:w="120"/>
-            </w:tcMar>
-            <w:vAlign w:val="center"/>
-          </w:tcPr>
-          <w:p>
-            <w:pPr>
-              <w:spacing w:after="40"/>
-            </w:pPr>
-            <w:r>
-              <w:t xml:space="preserve">Abonnement</w:t>
-            </w:r>
-          </w:p>
-        </w:tc>
-        <w:tc>
-          <w:tcPr>
-            <w:tcW w:type="dxa" w:w="3819"/>
-            <w:tcBorders>
-              <w:top w:val="single" w:color="D9D4D1" w:sz="4"/>
-              <w:left w:val="single" w:color="D9D4D1" w:sz="4"/>
-              <w:bottom w:val="single" w:color="D9D4D1" w:sz="4"/>
-              <w:right w:val="single" w:color="D9D4D1" w:sz="4"/>
-            </w:tcBorders>
-            <w:shd w:fill="FFFFFF" w:color="auto" w:val="clear"/>
-            <w:tcMar>
-              <w:top w:type="dxa" w:w="80"/>
-              <w:left w:type="dxa" w:w="120"/>
-              <w:bottom w:type="dxa" w:w="80"/>
-              <w:right w:type="dxa" w:w="120"/>
-            </w:tcMar>
-            <w:vAlign w:val="center"/>
-          </w:tcPr>
-          <w:p>
-            <w:pPr>
-              <w:spacing w:after="40"/>
-            </w:pPr>
-            <w:r>
-              <w:t xml:space="preserve">Claude</w:t>
-            </w:r>
-          </w:p>
-        </w:tc>
-        <w:tc>
-          <w:tcPr>
-            <w:tcW w:type="dxa" w:w="3819"/>
-            <w:tcBorders>
-              <w:top w:val="single" w:color="D9D4D1" w:sz="4"/>
-              <w:left w:val="single" w:color="D9D4D1" w:sz="4"/>
-              <w:bottom w:val="single" w:color="D9D4D1" w:sz="4"/>
-              <w:right w:val="single" w:color="D9D4D1" w:sz="4"/>
-            </w:tcBorders>
-            <w:shd w:fill="FFFFFF" w:color="auto" w:val="clear"/>
-            <w:tcMar>
-              <w:top w:type="dxa" w:w="80"/>
-              <w:left w:type="dxa" w:w="120"/>
-              <w:bottom w:type="dxa" w:w="80"/>
-              <w:right w:type="dxa" w:w="120"/>
-            </w:tcMar>
-            <w:vAlign w:val="center"/>
-          </w:tcPr>
-          <w:p>
-            <w:pPr>
-              <w:spacing w:after="40"/>
-            </w:pPr>
-            <w:r>
-              <w:t xml:space="preserve">ChatGPT payant (Plus, Pro, Business…)</w:t>
-            </w:r>
-          </w:p>
-        </w:tc>
-      </w:tr>
-    </w:tbl>
-    <w:p>
-      <w:pPr>
-        <w:pStyle w:val="Heading2"/>
-      </w:pPr>
-      <w:r>
-        <w:t xml:space="preserve">Votre clé d'accès</w:t>
+        <w:t xml:space="preserve">Exporter vers Excel</w:t>
       </w:r>
     </w:p>
     <w:p>
@@ -5435,9 +4787,9 @@
       <w:r>
         <w:drawing>
           <wp:inline distT="0" distB="0" distL="0" distR="0">
-            <wp:extent cx="3962400" cy="5334000"/>
+            <wp:extent cx="4953000" cy="923925"/>
             <wp:effectExtent t="0" r="0" b="0" l="0"/>
-            <wp:docPr id="1" name="16-chatgpt.png" descr="Compte → Lier à Claude ou ChatGPT : créer une clé, la copier ; l'administrateur active le connecteur ChatGPT." title="Compte → Lier à Claude ou ChatGPT : créer une clé, la copier ; l'administrateur active le connecteur ChatGPT."/>
+            <wp:docPr id="1" name="14-donnees.png" descr="Le bouton d'export dans la partie « Données »." title="Le bouton d'export dans la partie « Données »."/>
             <wp:cNvGraphicFramePr>
               <a:graphicFrameLocks xmlns:a="http://schemas.openxmlformats.org/drawingml/2006/main" noChangeAspect="1"/>
             </wp:cNvGraphicFramePr>
@@ -5460,7 +4812,7 @@
                   <pic:spPr bwMode="auto">
                     <a:xfrm>
                       <a:off x="0" y="0"/>
-                      <a:ext cx="3962400" cy="5334000"/>
+                      <a:ext cx="4953000" cy="923925"/>
                     </a:xfrm>
                     <a:prstGeom prst="rect">
                       <a:avLst/>
@@ -5486,7 +4838,22 @@
           <w:sz w:val="18"/>
           <w:szCs w:val="18"/>
         </w:rPr>
-        <w:t xml:space="preserve">Compte → Lier à Claude ou ChatGPT : créer une clé, la copier ; l'administrateur active le connecteur ChatGPT.</w:t>
+        <w:t xml:space="preserve">Le bouton d'export dans la partie « Données ».</w:t>
+      </w:r>
+    </w:p>
+    <w:p>
+      <w:pPr>
+        <w:spacing w:after="120"/>
+      </w:pPr>
+      <w:r>
+        <w:rPr>
+          <w:b/>
+          <w:bCs/>
+        </w:rPr>
+        <w:t xml:space="preserve">Exporter les tâches (Excel)</w:t>
+      </w:r>
+      <w:r>
+        <w:t xml:space="preserve"> télécharge un fichier avec les tâches que vous voyez : groupe, catégorie, titre, responsable, dates, avancement, statut. Il s'ouvre directement dans Excel.</w:t>
       </w:r>
     </w:p>
     <w:tbl>
@@ -5513,11 +4880,11 @@
             <w:tcW w:type="dxa" w:w="9638"/>
             <w:tcBorders>
               <w:top w:val="none" w:color="FFFFFF" w:sz="0"/>
-              <w:left w:val="single" w:color="C4122F" w:sz="24"/>
+              <w:left w:val="single" w:color="1D7A3F" w:sz="24"/>
               <w:bottom w:val="none" w:color="FFFFFF" w:sz="0"/>
               <w:right w:val="none" w:color="FFFFFF" w:sz="0"/>
             </w:tcBorders>
-            <w:shd w:fill="FBE6E9" w:color="auto" w:val="clear"/>
+            <w:shd w:fill="E3F2E8" w:color="auto" w:val="clear"/>
             <w:tcMar>
               <w:top w:type="dxa" w:w="120"/>
               <w:left w:type="dxa" w:w="200"/>
@@ -5533,89 +4900,444 @@
               <w:rPr>
                 <w:b/>
                 <w:bCs/>
-                <w:color w:val="C4122F"/>
+                <w:color w:val="1D7A3F"/>
               </w:rPr>
-              <w:t xml:space="preserve">❗  À savoir</w:t>
-            </w:r>
-          </w:p>
-          <w:p>
-            <w:pPr>
-              <w:spacing w:after="40"/>
-            </w:pPr>
-            <w:r>
-              <w:t xml:space="preserve">Claude agit </w:t>
-            </w:r>
+              <w:t xml:space="preserve">💡  Exporter une sélection</w:t>
+            </w:r>
+          </w:p>
+          <w:p>
+            <w:pPr>
+              <w:spacing w:after="40"/>
+            </w:pPr>
+            <w:r>
+              <w:t xml:space="preserve">L'export tient compte de la recherche et des filtres de l'accueil : filtrez d'abord (par exemple la catégorie « Devis »), puis exportez.</w:t>
+            </w:r>
+          </w:p>
+        </w:tc>
+      </w:tr>
+    </w:tbl>
+    <w:p>
+      <w:pPr>
+        <w:pStyle w:val="Heading1"/>
+        <w:keepNext/>
+        <w:pageBreakBefore/>
+      </w:pPr>
+      <w:r>
+        <w:t xml:space="preserve">10. Utiliser Claude ou ChatGPT</w:t>
+      </w:r>
+    </w:p>
+    <w:p>
+      <w:pPr>
+        <w:spacing w:after="120"/>
+      </w:pPr>
+      <w:r>
+        <w:t xml:space="preserve">Si </w:t>
+      </w:r>
+      <w:r>
+        <w:rPr>
+          <w:b/>
+          <w:bCs/>
+        </w:rPr>
+        <w:t xml:space="preserve">Claude</w:t>
+      </w:r>
+      <w:r>
+        <w:t xml:space="preserve"> ou </w:t>
+      </w:r>
+      <w:r>
+        <w:rPr>
+          <w:b/>
+          <w:bCs/>
+        </w:rPr>
+        <w:t xml:space="preserve">ChatGPT</w:t>
+      </w:r>
+      <w:r>
+        <w:t xml:space="preserve"> a été relié à votre compte (voir le guide d'installation, chapitre 8), vous pouvez lui parler de vos tâches en français. Les demandes et les possibilités sont les mêmes avec les deux assistants.</w:t>
+      </w:r>
+    </w:p>
+    <w:p>
+      <w:pPr>
+        <w:pStyle w:val="Heading2"/>
+      </w:pPr>
+      <w:r>
+        <w:t xml:space="preserve">Exemples de demandes</w:t>
+      </w:r>
+    </w:p>
+    <w:tbl>
+      <w:tblPr>
+        <w:tblW w:type="dxa" w:w="9638"/>
+        <w:tblBorders>
+          <w:top w:val="single" w:color="auto" w:sz="4"/>
+          <w:left w:val="single" w:color="auto" w:sz="4"/>
+          <w:bottom w:val="single" w:color="auto" w:sz="4"/>
+          <w:right w:val="single" w:color="auto" w:sz="4"/>
+          <w:insideH w:val="single" w:color="auto" w:sz="4"/>
+          <w:insideV w:val="single" w:color="auto" w:sz="4"/>
+        </w:tblBorders>
+      </w:tblPr>
+      <w:tblGrid>
+        <w:gridCol w:w="5400"/>
+        <w:gridCol w:w="4238"/>
+      </w:tblGrid>
+      <w:tr>
+        <w:trPr>
+          <w:cantSplit/>
+        </w:trPr>
+        <w:tc>
+          <w:tcPr>
+            <w:tcW w:type="dxa" w:w="5400"/>
+            <w:tcBorders>
+              <w:top w:val="single" w:color="D9D4D1" w:sz="4"/>
+              <w:left w:val="single" w:color="D9D4D1" w:sz="4"/>
+              <w:bottom w:val="single" w:color="D9D4D1" w:sz="4"/>
+              <w:right w:val="single" w:color="D9D4D1" w:sz="4"/>
+            </w:tcBorders>
+            <w:shd w:fill="C4122F" w:color="auto" w:val="clear"/>
+            <w:tcMar>
+              <w:top w:type="dxa" w:w="80"/>
+              <w:left w:type="dxa" w:w="120"/>
+              <w:bottom w:type="dxa" w:w="80"/>
+              <w:right w:type="dxa" w:w="120"/>
+            </w:tcMar>
+            <w:vAlign w:val="center"/>
+          </w:tcPr>
+          <w:p>
+            <w:pPr>
+              <w:spacing w:after="40"/>
+            </w:pPr>
             <w:r>
               <w:rPr>
                 <w:b/>
                 <w:bCs/>
+                <w:color w:val="FFFFFF"/>
               </w:rPr>
-              <w:t xml:space="preserve">avec vos droits</w:t>
-            </w:r>
-            <w:r>
-              <w:t xml:space="preserve"> : il voit exactement ce que vous voyez, et ses actions apparaissent dans l'historique </w:t>
-            </w:r>
+              <w:t xml:space="preserve">Vous écrivez…</w:t>
+            </w:r>
+          </w:p>
+        </w:tc>
+        <w:tc>
+          <w:tcPr>
+            <w:tcW w:type="dxa" w:w="4238"/>
+            <w:tcBorders>
+              <w:top w:val="single" w:color="D9D4D1" w:sz="4"/>
+              <w:left w:val="single" w:color="D9D4D1" w:sz="4"/>
+              <w:bottom w:val="single" w:color="D9D4D1" w:sz="4"/>
+              <w:right w:val="single" w:color="D9D4D1" w:sz="4"/>
+            </w:tcBorders>
+            <w:shd w:fill="C4122F" w:color="auto" w:val="clear"/>
+            <w:tcMar>
+              <w:top w:type="dxa" w:w="80"/>
+              <w:left w:type="dxa" w:w="120"/>
+              <w:bottom w:type="dxa" w:w="80"/>
+              <w:right w:type="dxa" w:w="120"/>
+            </w:tcMar>
+            <w:vAlign w:val="center"/>
+          </w:tcPr>
+          <w:p>
+            <w:pPr>
+              <w:spacing w:after="40"/>
+            </w:pPr>
             <w:r>
               <w:rPr>
                 <w:b/>
                 <w:bCs/>
+                <w:color w:val="FFFFFF"/>
               </w:rPr>
-              <w:t xml:space="preserve">à votre nom</w:t>
-            </w:r>
-            <w:r>
-              <w:t xml:space="preserve">.</w:t>
-            </w:r>
-          </w:p>
-          <w:p>
-            <w:pPr>
-              <w:spacing w:after="40"/>
-            </w:pPr>
-            <w:r>
-              <w:t xml:space="preserve">Claude ne peut </w:t>
-            </w:r>
-            <w:r>
-              <w:rPr>
-                <w:b/>
-                <w:bCs/>
-              </w:rPr>
-              <w:t xml:space="preserve">rien supprimer</w:t>
-            </w:r>
-            <w:r>
-              <w:t xml:space="preserve">.</w:t>
-            </w:r>
-          </w:p>
-          <w:p>
-            <w:pPr>
-              <w:spacing w:after="40"/>
-            </w:pPr>
-            <w:r>
-              <w:t xml:space="preserve">La clé est </w:t>
-            </w:r>
-            <w:r>
-              <w:rPr>
-                <w:b/>
-                <w:bCs/>
-              </w:rPr>
-              <w:t xml:space="preserve">personnelle et secrète</w:t>
-            </w:r>
-            <w:r>
-              <w:t xml:space="preserve"> : ne la partagez pas. En cas de doute, supprimez-la (corbeille) et créez-en une nouvelle.</w:t>
-            </w:r>
-          </w:p>
-          <w:p>
-            <w:pPr>
-              <w:spacing w:after="40"/>
-            </w:pPr>
-            <w:r>
-              <w:t xml:space="preserve">Claude : seulement avec l'application Claude installée sur un PC du bureau (pas claude.ai dans le navigateur, ni le téléphone).</w:t>
-            </w:r>
-          </w:p>
-          <w:p>
-            <w:pPr>
-              <w:spacing w:after="40"/>
-            </w:pPr>
-            <w:r>
-              <w:t xml:space="preserve">ChatGPT : seulement pendant que le tunnel est ouvert sur le PC serveur ; l'adresse du connecteur contient votre clé, ne la partagez pas.</w:t>
+              <w:t xml:space="preserve">L'assistant…</w:t>
+            </w:r>
+          </w:p>
+        </w:tc>
+      </w:tr>
+      <w:tr>
+        <w:trPr>
+          <w:cantSplit/>
+        </w:trPr>
+        <w:tc>
+          <w:tcPr>
+            <w:tcW w:type="dxa" w:w="5400"/>
+            <w:tcBorders>
+              <w:top w:val="single" w:color="D9D4D1" w:sz="4"/>
+              <w:left w:val="single" w:color="D9D4D1" w:sz="4"/>
+              <w:bottom w:val="single" w:color="D9D4D1" w:sz="4"/>
+              <w:right w:val="single" w:color="D9D4D1" w:sz="4"/>
+            </w:tcBorders>
+            <w:shd w:fill="FFFFFF" w:color="auto" w:val="clear"/>
+            <w:tcMar>
+              <w:top w:type="dxa" w:w="80"/>
+              <w:left w:type="dxa" w:w="120"/>
+              <w:bottom w:type="dxa" w:w="80"/>
+              <w:right w:type="dxa" w:w="120"/>
+            </w:tcMar>
+            <w:vAlign w:val="center"/>
+          </w:tcPr>
+          <w:p>
+            <w:pPr>
+              <w:spacing w:after="40"/>
+            </w:pPr>
+            <w:r>
+              <w:t xml:space="preserve">« Qu'est-ce qui est en retard ? Résume-moi la semaine. »</w:t>
+            </w:r>
+          </w:p>
+        </w:tc>
+        <w:tc>
+          <w:tcPr>
+            <w:tcW w:type="dxa" w:w="4238"/>
+            <w:tcBorders>
+              <w:top w:val="single" w:color="D9D4D1" w:sz="4"/>
+              <w:left w:val="single" w:color="D9D4D1" w:sz="4"/>
+              <w:bottom w:val="single" w:color="D9D4D1" w:sz="4"/>
+              <w:right w:val="single" w:color="D9D4D1" w:sz="4"/>
+            </w:tcBorders>
+            <w:shd w:fill="FFFFFF" w:color="auto" w:val="clear"/>
+            <w:tcMar>
+              <w:top w:type="dxa" w:w="80"/>
+              <w:left w:type="dxa" w:w="120"/>
+              <w:bottom w:type="dxa" w:w="80"/>
+              <w:right w:type="dxa" w:w="120"/>
+            </w:tcMar>
+            <w:vAlign w:val="center"/>
+          </w:tcPr>
+          <w:p>
+            <w:pPr>
+              <w:spacing w:after="40"/>
+            </w:pPr>
+            <w:r>
+              <w:t xml:space="preserve">liste les tâches en retard et les échéances des 7 prochains jours.</w:t>
+            </w:r>
+          </w:p>
+        </w:tc>
+      </w:tr>
+      <w:tr>
+        <w:trPr>
+          <w:cantSplit/>
+        </w:trPr>
+        <w:tc>
+          <w:tcPr>
+            <w:tcW w:type="dxa" w:w="5400"/>
+            <w:tcBorders>
+              <w:top w:val="single" w:color="D9D4D1" w:sz="4"/>
+              <w:left w:val="single" w:color="D9D4D1" w:sz="4"/>
+              <w:bottom w:val="single" w:color="D9D4D1" w:sz="4"/>
+              <w:right w:val="single" w:color="D9D4D1" w:sz="4"/>
+            </w:tcBorders>
+            <w:shd w:fill="F7F5F4" w:color="auto" w:val="clear"/>
+            <w:tcMar>
+              <w:top w:type="dxa" w:w="80"/>
+              <w:left w:type="dxa" w:w="120"/>
+              <w:bottom w:type="dxa" w:w="80"/>
+              <w:right w:type="dxa" w:w="120"/>
+            </w:tcMar>
+            <w:vAlign w:val="center"/>
+          </w:tcPr>
+          <w:p>
+            <w:pPr>
+              <w:spacing w:after="40"/>
+            </w:pPr>
+            <w:r>
+              <w:t xml:space="preserve">« Crée un devis urgent pour l'élevage Martin dans Le Roy, pour Claire, à rendre le 15/11, avec les étapes visite, chiffrage, envoi. »</w:t>
+            </w:r>
+          </w:p>
+        </w:tc>
+        <w:tc>
+          <w:tcPr>
+            <w:tcW w:type="dxa" w:w="4238"/>
+            <w:tcBorders>
+              <w:top w:val="single" w:color="D9D4D1" w:sz="4"/>
+              <w:left w:val="single" w:color="D9D4D1" w:sz="4"/>
+              <w:bottom w:val="single" w:color="D9D4D1" w:sz="4"/>
+              <w:right w:val="single" w:color="D9D4D1" w:sz="4"/>
+            </w:tcBorders>
+            <w:shd w:fill="F7F5F4" w:color="auto" w:val="clear"/>
+            <w:tcMar>
+              <w:top w:type="dxa" w:w="80"/>
+              <w:left w:type="dxa" w:w="120"/>
+              <w:bottom w:type="dxa" w:w="80"/>
+              <w:right w:type="dxa" w:w="120"/>
+            </w:tcMar>
+            <w:vAlign w:val="center"/>
+          </w:tcPr>
+          <w:p>
+            <w:pPr>
+              <w:spacing w:after="40"/>
+            </w:pPr>
+            <w:r>
+              <w:t xml:space="preserve">crée la tâche avec sa priorité et ses étapes.</w:t>
+            </w:r>
+          </w:p>
+        </w:tc>
+      </w:tr>
+      <w:tr>
+        <w:trPr>
+          <w:cantSplit/>
+        </w:trPr>
+        <w:tc>
+          <w:tcPr>
+            <w:tcW w:type="dxa" w:w="5400"/>
+            <w:tcBorders>
+              <w:top w:val="single" w:color="D9D4D1" w:sz="4"/>
+              <w:left w:val="single" w:color="D9D4D1" w:sz="4"/>
+              <w:bottom w:val="single" w:color="D9D4D1" w:sz="4"/>
+              <w:right w:val="single" w:color="D9D4D1" w:sz="4"/>
+            </w:tcBorders>
+            <w:shd w:fill="FFFFFF" w:color="auto" w:val="clear"/>
+            <w:tcMar>
+              <w:top w:type="dxa" w:w="80"/>
+              <w:left w:type="dxa" w:w="120"/>
+              <w:bottom w:type="dxa" w:w="80"/>
+              <w:right w:type="dxa" w:w="120"/>
+            </w:tcMar>
+            <w:vAlign w:val="center"/>
+          </w:tcPr>
+          <w:p>
+            <w:pPr>
+              <w:spacing w:after="40"/>
+            </w:pPr>
+            <w:r>
+              <w:t xml:space="preserve">« Coche l'étape chiffrage du devis Martin et ajoute un commentaire : client rappelé. »</w:t>
+            </w:r>
+          </w:p>
+        </w:tc>
+        <w:tc>
+          <w:tcPr>
+            <w:tcW w:type="dxa" w:w="4238"/>
+            <w:tcBorders>
+              <w:top w:val="single" w:color="D9D4D1" w:sz="4"/>
+              <w:left w:val="single" w:color="D9D4D1" w:sz="4"/>
+              <w:bottom w:val="single" w:color="D9D4D1" w:sz="4"/>
+              <w:right w:val="single" w:color="D9D4D1" w:sz="4"/>
+            </w:tcBorders>
+            <w:shd w:fill="FFFFFF" w:color="auto" w:val="clear"/>
+            <w:tcMar>
+              <w:top w:type="dxa" w:w="80"/>
+              <w:left w:type="dxa" w:w="120"/>
+              <w:bottom w:type="dxa" w:w="80"/>
+              <w:right w:type="dxa" w:w="120"/>
+            </w:tcMar>
+            <w:vAlign w:val="center"/>
+          </w:tcPr>
+          <w:p>
+            <w:pPr>
+              <w:spacing w:after="40"/>
+            </w:pPr>
+            <w:r>
+              <w:t xml:space="preserve">coche l'étape et ajoute le commentaire.</w:t>
+            </w:r>
+          </w:p>
+        </w:tc>
+      </w:tr>
+      <w:tr>
+        <w:trPr>
+          <w:cantSplit/>
+        </w:trPr>
+        <w:tc>
+          <w:tcPr>
+            <w:tcW w:type="dxa" w:w="5400"/>
+            <w:tcBorders>
+              <w:top w:val="single" w:color="D9D4D1" w:sz="4"/>
+              <w:left w:val="single" w:color="D9D4D1" w:sz="4"/>
+              <w:bottom w:val="single" w:color="D9D4D1" w:sz="4"/>
+              <w:right w:val="single" w:color="D9D4D1" w:sz="4"/>
+            </w:tcBorders>
+            <w:shd w:fill="F7F5F4" w:color="auto" w:val="clear"/>
+            <w:tcMar>
+              <w:top w:type="dxa" w:w="80"/>
+              <w:left w:type="dxa" w:w="120"/>
+              <w:bottom w:type="dxa" w:w="80"/>
+              <w:right w:type="dxa" w:w="120"/>
+            </w:tcMar>
+            <w:vAlign w:val="center"/>
+          </w:tcPr>
+          <w:p>
+            <w:pPr>
+              <w:spacing w:after="40"/>
+            </w:pPr>
+            <w:r>
+              <w:t xml:space="preserve">« Quelles tâches de Julien finissent ce mois-ci ? »</w:t>
+            </w:r>
+          </w:p>
+        </w:tc>
+        <w:tc>
+          <w:tcPr>
+            <w:tcW w:type="dxa" w:w="4238"/>
+            <w:tcBorders>
+              <w:top w:val="single" w:color="D9D4D1" w:sz="4"/>
+              <w:left w:val="single" w:color="D9D4D1" w:sz="4"/>
+              <w:bottom w:val="single" w:color="D9D4D1" w:sz="4"/>
+              <w:right w:val="single" w:color="D9D4D1" w:sz="4"/>
+            </w:tcBorders>
+            <w:shd w:fill="F7F5F4" w:color="auto" w:val="clear"/>
+            <w:tcMar>
+              <w:top w:type="dxa" w:w="80"/>
+              <w:left w:type="dxa" w:w="120"/>
+              <w:bottom w:type="dxa" w:w="80"/>
+              <w:right w:type="dxa" w:w="120"/>
+            </w:tcMar>
+            <w:vAlign w:val="center"/>
+          </w:tcPr>
+          <w:p>
+            <w:pPr>
+              <w:spacing w:after="40"/>
+            </w:pPr>
+            <w:r>
+              <w:t xml:space="preserve">filtre par personne et par date.</w:t>
+            </w:r>
+          </w:p>
+        </w:tc>
+      </w:tr>
+      <w:tr>
+        <w:trPr>
+          <w:cantSplit/>
+        </w:trPr>
+        <w:tc>
+          <w:tcPr>
+            <w:tcW w:type="dxa" w:w="5400"/>
+            <w:tcBorders>
+              <w:top w:val="single" w:color="D9D4D1" w:sz="4"/>
+              <w:left w:val="single" w:color="D9D4D1" w:sz="4"/>
+              <w:bottom w:val="single" w:color="D9D4D1" w:sz="4"/>
+              <w:right w:val="single" w:color="D9D4D1" w:sz="4"/>
+            </w:tcBorders>
+            <w:shd w:fill="FFFFFF" w:color="auto" w:val="clear"/>
+            <w:tcMar>
+              <w:top w:type="dxa" w:w="80"/>
+              <w:left w:type="dxa" w:w="120"/>
+              <w:bottom w:type="dxa" w:w="80"/>
+              <w:right w:type="dxa" w:w="120"/>
+            </w:tcMar>
+            <w:vAlign w:val="center"/>
+          </w:tcPr>
+          <w:p>
+            <w:pPr>
+              <w:spacing w:after="40"/>
+            </w:pPr>
+            <w:r>
+              <w:t xml:space="preserve">« Repousse la fin du chantier ventilation au 30 novembre. »</w:t>
+            </w:r>
+          </w:p>
+        </w:tc>
+        <w:tc>
+          <w:tcPr>
+            <w:tcW w:type="dxa" w:w="4238"/>
+            <w:tcBorders>
+              <w:top w:val="single" w:color="D9D4D1" w:sz="4"/>
+              <w:left w:val="single" w:color="D9D4D1" w:sz="4"/>
+              <w:bottom w:val="single" w:color="D9D4D1" w:sz="4"/>
+              <w:right w:val="single" w:color="D9D4D1" w:sz="4"/>
+            </w:tcBorders>
+            <w:shd w:fill="FFFFFF" w:color="auto" w:val="clear"/>
+            <w:tcMar>
+              <w:top w:type="dxa" w:w="80"/>
+              <w:left w:type="dxa" w:w="120"/>
+              <w:bottom w:type="dxa" w:w="80"/>
+              <w:right w:type="dxa" w:w="120"/>
+            </w:tcMar>
+            <w:vAlign w:val="center"/>
+          </w:tcPr>
+          <w:p>
+            <w:pPr>
+              <w:spacing w:after="40"/>
+            </w:pPr>
+            <w:r>
+              <w:t xml:space="preserve">modifie la date de fin.</w:t>
             </w:r>
           </w:p>
         </w:tc>
@@ -5623,20 +5345,10 @@
     </w:tbl>
     <w:p>
       <w:pPr>
-        <w:pStyle w:val="Heading1"/>
-        <w:keepNext/>
-        <w:pageBreakBefore/>
-      </w:pPr>
-      <w:r>
-        <w:t xml:space="preserve">11. Pour l'administrateur</w:t>
-      </w:r>
-    </w:p>
-    <w:p>
-      <w:pPr>
         <w:pStyle w:val="Heading2"/>
       </w:pPr>
       <w:r>
-        <w:t xml:space="preserve">Tout voir, et filtrer par personne</w:t>
+        <w:t xml:space="preserve">Votre lien personnel</w:t>
       </w:r>
     </w:p>
     <w:p>
@@ -5644,27 +5356,47 @@
         <w:spacing w:after="120"/>
       </w:pPr>
       <w:r>
-        <w:t xml:space="preserve">L'administrateur voit </w:t>
-      </w:r>
-      <w:r>
-        <w:rPr>
-          <w:b/>
-          <w:bCs/>
-        </w:rPr>
-        <w:t xml:space="preserve">toutes</w:t>
-      </w:r>
-      <w:r>
-        <w:t xml:space="preserve"> les tâches. La ligne </w:t>
-      </w:r>
-      <w:r>
-        <w:rPr>
-          <w:b/>
-          <w:bCs/>
-        </w:rPr>
-        <w:t xml:space="preserve">Afficher</w:t>
-      </w:r>
-      <w:r>
-        <w:t xml:space="preserve"> permet de choisir une ou plusieurs personnes (ou « Tout le monde »). Les groupes privés apparaissent sous la forme « Perso · Prénom ».</w:t>
+        <w:t xml:space="preserve">Dans </w:t>
+      </w:r>
+      <w:r>
+        <w:rPr>
+          <w:b/>
+          <w:bCs/>
+        </w:rPr>
+        <w:t xml:space="preserve">Compte → Lier à Claude ou ChatGPT</w:t>
+      </w:r>
+      <w:r>
+        <w:t xml:space="preserve">, </w:t>
+      </w:r>
+      <w:r>
+        <w:rPr>
+          <w:b/>
+          <w:bCs/>
+        </w:rPr>
+        <w:t xml:space="preserve">Créer une clé d'accès</w:t>
+      </w:r>
+      <w:r>
+        <w:t xml:space="preserve"> affiche un </w:t>
+      </w:r>
+      <w:r>
+        <w:rPr>
+          <w:b/>
+          <w:bCs/>
+        </w:rPr>
+        <w:t xml:space="preserve">lien personnel</w:t>
+      </w:r>
+      <w:r>
+        <w:t xml:space="preserve">. Copiez-le (il ne sera plus affiché) et collez-le dans Claude (« Paramètres → Connecteurs → Ajouter un connecteur personnalisé ») ou dans ChatGPT (« Paramètres → Applications et connecteurs → mode développeur → Créer », authentification « Aucune »). L'administrateur doit avoir </w:t>
+      </w:r>
+      <w:r>
+        <w:rPr>
+          <w:b/>
+          <w:bCs/>
+        </w:rPr>
+        <w:t xml:space="preserve">activé le connecteur</w:t>
+      </w:r>
+      <w:r>
+        <w:t xml:space="preserve"> au préalable.</w:t>
       </w:r>
     </w:p>
     <w:p>
@@ -5676,9 +5408,9 @@
       <w:r>
         <w:drawing>
           <wp:inline distT="0" distB="0" distL="0" distR="0">
-            <wp:extent cx="5143500" cy="3219450"/>
+            <wp:extent cx="4191000" cy="3686175"/>
             <wp:effectExtent t="0" r="0" b="0" l="0"/>
-            <wp:docPr id="1" name="11-admin-filtre.png" descr="Vue administrateur filtrée sur Claire." title="Vue administrateur filtrée sur Claire."/>
+            <wp:docPr id="1" name="16-chatgpt.png" descr="Compte → Lier à Claude ou ChatGPT : créer une clé, copier le lien ; l'administrateur active le connecteur." title="Compte → Lier à Claude ou ChatGPT : créer une clé, copier le lien ; l'administrateur active le connecteur."/>
             <wp:cNvGraphicFramePr>
               <a:graphicFrameLocks xmlns:a="http://schemas.openxmlformats.org/drawingml/2006/main" noChangeAspect="1"/>
             </wp:cNvGraphicFramePr>
@@ -5701,7 +5433,7 @@
                   <pic:spPr bwMode="auto">
                     <a:xfrm>
                       <a:off x="0" y="0"/>
-                      <a:ext cx="5143500" cy="3219450"/>
+                      <a:ext cx="4191000" cy="3686175"/>
                     </a:xfrm>
                     <a:prstGeom prst="rect">
                       <a:avLst/>
@@ -5727,7 +5459,141 @@
           <w:sz w:val="18"/>
           <w:szCs w:val="18"/>
         </w:rPr>
-        <w:t xml:space="preserve">Vue administrateur filtrée sur Claire.</w:t>
+        <w:t xml:space="preserve">Compte → Lier à Claude ou ChatGPT : créer une clé, copier le lien ; l'administrateur active le connecteur.</w:t>
+      </w:r>
+    </w:p>
+    <w:tbl>
+      <w:tblPr>
+        <w:tblW w:type="dxa" w:w="9638"/>
+        <w:tblBorders>
+          <w:top w:val="single" w:color="auto" w:sz="4"/>
+          <w:left w:val="single" w:color="auto" w:sz="4"/>
+          <w:bottom w:val="single" w:color="auto" w:sz="4"/>
+          <w:right w:val="single" w:color="auto" w:sz="4"/>
+          <w:insideH w:val="single" w:color="auto" w:sz="4"/>
+          <w:insideV w:val="single" w:color="auto" w:sz="4"/>
+        </w:tblBorders>
+      </w:tblPr>
+      <w:tblGrid>
+        <w:gridCol w:w="9638"/>
+      </w:tblGrid>
+      <w:tr>
+        <w:trPr>
+          <w:cantSplit/>
+        </w:trPr>
+        <w:tc>
+          <w:tcPr>
+            <w:tcW w:type="dxa" w:w="9638"/>
+            <w:tcBorders>
+              <w:top w:val="none" w:color="FFFFFF" w:sz="0"/>
+              <w:left w:val="single" w:color="C4122F" w:sz="24"/>
+              <w:bottom w:val="none" w:color="FFFFFF" w:sz="0"/>
+              <w:right w:val="none" w:color="FFFFFF" w:sz="0"/>
+            </w:tcBorders>
+            <w:shd w:fill="FBE6E9" w:color="auto" w:val="clear"/>
+            <w:tcMar>
+              <w:top w:type="dxa" w:w="120"/>
+              <w:left w:type="dxa" w:w="200"/>
+              <w:bottom w:type="dxa" w:w="120"/>
+              <w:right w:type="dxa" w:w="200"/>
+            </w:tcMar>
+          </w:tcPr>
+          <w:p>
+            <w:pPr>
+              <w:spacing w:after="60"/>
+            </w:pPr>
+            <w:r>
+              <w:rPr>
+                <w:b/>
+                <w:bCs/>
+                <w:color w:val="C4122F"/>
+              </w:rPr>
+              <w:t xml:space="preserve">❗  À savoir</w:t>
+            </w:r>
+          </w:p>
+          <w:p>
+            <w:pPr>
+              <w:spacing w:after="40"/>
+            </w:pPr>
+            <w:r>
+              <w:t xml:space="preserve">L'assistant agit </w:t>
+            </w:r>
+            <w:r>
+              <w:rPr>
+                <w:b/>
+                <w:bCs/>
+              </w:rPr>
+              <w:t xml:space="preserve">avec vos droits</w:t>
+            </w:r>
+            <w:r>
+              <w:t xml:space="preserve"> : il voit exactement ce que vous voyez, et ses actions apparaissent dans l'historique </w:t>
+            </w:r>
+            <w:r>
+              <w:rPr>
+                <w:b/>
+                <w:bCs/>
+              </w:rPr>
+              <w:t xml:space="preserve">à votre nom</w:t>
+            </w:r>
+            <w:r>
+              <w:t xml:space="preserve">.</w:t>
+            </w:r>
+          </w:p>
+          <w:p>
+            <w:pPr>
+              <w:spacing w:after="40"/>
+            </w:pPr>
+            <w:r>
+              <w:t xml:space="preserve">Il ne peut </w:t>
+            </w:r>
+            <w:r>
+              <w:rPr>
+                <w:b/>
+                <w:bCs/>
+              </w:rPr>
+              <w:t xml:space="preserve">rien supprimer</w:t>
+            </w:r>
+            <w:r>
+              <w:t xml:space="preserve">.</w:t>
+            </w:r>
+          </w:p>
+          <w:p>
+            <w:pPr>
+              <w:spacing w:after="40"/>
+            </w:pPr>
+            <w:r>
+              <w:t xml:space="preserve">Le lien est </w:t>
+            </w:r>
+            <w:r>
+              <w:rPr>
+                <w:b/>
+                <w:bCs/>
+              </w:rPr>
+              <w:t xml:space="preserve">personnel et secret</w:t>
+            </w:r>
+            <w:r>
+              <w:t xml:space="preserve"> : ne le partagez pas. En cas de doute, supprimez la clé (corbeille) et créez-en une nouvelle.</w:t>
+            </w:r>
+          </w:p>
+          <w:p>
+            <w:pPr>
+              <w:spacing w:after="40"/>
+            </w:pPr>
+            <w:r>
+              <w:t xml:space="preserve">Selon votre formule Claude ou ChatGPT, les connecteurs personnalisés peuvent ne pas être disponibles.</w:t>
+            </w:r>
+          </w:p>
+        </w:tc>
+      </w:tr>
+    </w:tbl>
+    <w:p>
+      <w:pPr>
+        <w:pStyle w:val="Heading1"/>
+        <w:keepNext/>
+        <w:pageBreakBefore/>
+      </w:pPr>
+      <w:r>
+        <w:t xml:space="preserve">11. Pour l'administrateur</w:t>
       </w:r>
     </w:p>
     <w:p>
@@ -5735,7 +5601,7 @@
         <w:pStyle w:val="Heading2"/>
       </w:pPr>
       <w:r>
-        <w:t xml:space="preserve">Gérer l'équipe</w:t>
+        <w:t xml:space="preserve">Tout voir, et filtrer par personne</w:t>
       </w:r>
     </w:p>
     <w:p>
@@ -5743,133 +5609,27 @@
         <w:spacing w:after="120"/>
       </w:pPr>
       <w:r>
-        <w:t xml:space="preserve">Onglet </w:t>
-      </w:r>
-      <w:r>
-        <w:rPr>
-          <w:b/>
-          <w:bCs/>
-        </w:rPr>
-        <w:t xml:space="preserve">Compte</w:t>
-      </w:r>
-      <w:r>
-        <w:t xml:space="preserve"> → partie </w:t>
-      </w:r>
-      <w:r>
-        <w:rPr>
-          <w:b/>
-          <w:bCs/>
-        </w:rPr>
-        <w:t xml:space="preserve">Équipe</w:t>
-      </w:r>
-      <w:r>
-        <w:t xml:space="preserve"> :</w:t>
-      </w:r>
-    </w:p>
-    <w:p>
-      <w:pPr>
-        <w:pStyle w:val="ListParagraph"/>
-        <w:numPr>
-          <w:ilvl w:val="0"/>
-          <w:numId w:val="3"/>
-        </w:numPr>
-        <w:spacing w:after="80"/>
-      </w:pPr>
-      <w:r>
-        <w:rPr>
-          <w:b/>
-          <w:bCs/>
-        </w:rPr>
-        <w:t xml:space="preserve">Ajouter</w:t>
-      </w:r>
-      <w:r>
-        <w:t xml:space="preserve"> une personne : nom, mot de passe provisoire, rôle → </w:t>
-      </w:r>
-      <w:r>
-        <w:rPr>
-          <w:b/>
-          <w:bCs/>
-        </w:rPr>
-        <w:t xml:space="preserve">Ajouter</w:t>
-      </w:r>
-      <w:r>
-        <w:t xml:space="preserve">. Elle reçoit automatiquement son groupe « Perso ».</w:t>
-      </w:r>
-    </w:p>
-    <w:p>
-      <w:pPr>
-        <w:pStyle w:val="ListParagraph"/>
-        <w:numPr>
-          <w:ilvl w:val="0"/>
-          <w:numId w:val="3"/>
-        </w:numPr>
-        <w:spacing w:after="80"/>
-      </w:pPr>
-      <w:r>
-        <w:rPr>
-          <w:b/>
-          <w:bCs/>
-        </w:rPr>
-        <w:t xml:space="preserve">Le crayon</w:t>
-      </w:r>
-      <w:r>
-        <w:t xml:space="preserve"> sur une ligne permet de : renommer, donner un </w:t>
-      </w:r>
-      <w:r>
-        <w:rPr>
-          <w:b/>
-          <w:bCs/>
-        </w:rPr>
-        <w:t xml:space="preserve">nouveau mot de passe</w:t>
-      </w:r>
-      <w:r>
-        <w:t xml:space="preserve"> (oubli), changer le rôle, ou </w:t>
-      </w:r>
-      <w:r>
-        <w:rPr>
-          <w:b/>
-          <w:bCs/>
-        </w:rPr>
-        <w:t xml:space="preserve">désactiver</w:t>
-      </w:r>
-      <w:r>
-        <w:t xml:space="preserve"> le compte (case « Compte actif »).</w:t>
-      </w:r>
-    </w:p>
-    <w:p>
-      <w:pPr>
-        <w:pStyle w:val="ListParagraph"/>
-        <w:numPr>
-          <w:ilvl w:val="0"/>
-          <w:numId w:val="3"/>
-        </w:numPr>
-        <w:spacing w:after="80"/>
-      </w:pPr>
-      <w:r>
-        <w:t xml:space="preserve">Un compte désactivé ne peut plus se connecter, mais </w:t>
-      </w:r>
-      <w:r>
-        <w:rPr>
-          <w:b/>
-          <w:bCs/>
-        </w:rPr>
-        <w:t xml:space="preserve">ses tâches restent</w:t>
-      </w:r>
-      <w:r>
-        <w:t xml:space="preserve">. On peut le réactiver à tout moment.</w:t>
-      </w:r>
-    </w:p>
-    <w:p>
-      <w:pPr>
-        <w:pStyle w:val="ListParagraph"/>
-        <w:numPr>
-          <w:ilvl w:val="0"/>
-          <w:numId w:val="3"/>
-        </w:numPr>
-        <w:spacing w:after="80"/>
-      </w:pPr>
-      <w:r>
-        <w:t xml:space="preserve">Il reste toujours au moins un administrateur actif (l'application l'empêche autrement).</w:t>
+        <w:t xml:space="preserve">L'administrateur voit </w:t>
+      </w:r>
+      <w:r>
+        <w:rPr>
+          <w:b/>
+          <w:bCs/>
+        </w:rPr>
+        <w:t xml:space="preserve">toutes</w:t>
+      </w:r>
+      <w:r>
+        <w:t xml:space="preserve"> les tâches. La ligne </w:t>
+      </w:r>
+      <w:r>
+        <w:rPr>
+          <w:b/>
+          <w:bCs/>
+        </w:rPr>
+        <w:t xml:space="preserve">Afficher</w:t>
+      </w:r>
+      <w:r>
+        <w:t xml:space="preserve"> permet de choisir une ou plusieurs personnes (ou « Tout le monde »). Les groupes privés apparaissent sous la forme « Perso · Prénom ».</w:t>
       </w:r>
     </w:p>
     <w:p>
@@ -5881,9 +5641,9 @@
       <w:r>
         <w:drawing>
           <wp:inline distT="0" distB="0" distL="0" distR="0">
-            <wp:extent cx="5334000" cy="3743325"/>
+            <wp:extent cx="5143500" cy="3219450"/>
             <wp:effectExtent t="0" r="0" b="0" l="0"/>
-            <wp:docPr id="1" name="12-equipe.png" descr="Modification d'un compte depuis la liste de l'équipe." title="Modification d'un compte depuis la liste de l'équipe."/>
+            <wp:docPr id="1" name="11-admin-filtre.png" descr="Vue administrateur filtrée sur Claire." title="Vue administrateur filtrée sur Claire."/>
             <wp:cNvGraphicFramePr>
               <a:graphicFrameLocks xmlns:a="http://schemas.openxmlformats.org/drawingml/2006/main" noChangeAspect="1"/>
             </wp:cNvGraphicFramePr>
@@ -5906,7 +5666,7 @@
                   <pic:spPr bwMode="auto">
                     <a:xfrm>
                       <a:off x="0" y="0"/>
-                      <a:ext cx="5334000" cy="3743325"/>
+                      <a:ext cx="5143500" cy="3219450"/>
                     </a:xfrm>
                     <a:prstGeom prst="rect">
                       <a:avLst/>
@@ -5932,7 +5692,7 @@
           <w:sz w:val="18"/>
           <w:szCs w:val="18"/>
         </w:rPr>
-        <w:t xml:space="preserve">Modification d'un compte depuis la liste de l'équipe.</w:t>
+        <w:t xml:space="preserve">Vue administrateur filtrée sur Claire.</w:t>
       </w:r>
     </w:p>
     <w:p>
@@ -5940,7 +5700,7 @@
         <w:pStyle w:val="Heading2"/>
       </w:pPr>
       <w:r>
-        <w:t xml:space="preserve">L'historique des tâches terminées</w:t>
+        <w:t xml:space="preserve">Gérer l'équipe</w:t>
       </w:r>
     </w:p>
     <w:p>
@@ -5948,37 +5708,133 @@
         <w:spacing w:after="120"/>
       </w:pPr>
       <w:r>
-        <w:t xml:space="preserve">L'onglet </w:t>
-      </w:r>
-      <w:r>
-        <w:rPr>
-          <w:b/>
-          <w:bCs/>
-        </w:rPr>
-        <w:t xml:space="preserve">Historique</w:t>
-      </w:r>
-      <w:r>
-        <w:t xml:space="preserve"> (visible par l'administrateur uniquement) liste toutes les tâches terminées : date, tâche, groupe, </w:t>
-      </w:r>
-      <w:r>
-        <w:rPr>
-          <w:b/>
-          <w:bCs/>
-        </w:rPr>
-        <w:t xml:space="preserve">qui l'a validée</w:t>
-      </w:r>
-      <w:r>
-        <w:t xml:space="preserve">, et si elle est encore affichée ou déjà archivée (plus de 7 jours). Cliquez sur une ligne pour voir chaque étape avec </w:t>
-      </w:r>
-      <w:r>
-        <w:rPr>
-          <w:b/>
-          <w:bCs/>
-        </w:rPr>
-        <w:t xml:space="preserve">qui l'a cochée et quand</w:t>
-      </w:r>
-      <w:r>
-        <w:t xml:space="preserve">. La recherche et l'export Excel fonctionnent aussi ici.</w:t>
+        <w:t xml:space="preserve">Onglet </w:t>
+      </w:r>
+      <w:r>
+        <w:rPr>
+          <w:b/>
+          <w:bCs/>
+        </w:rPr>
+        <w:t xml:space="preserve">Compte</w:t>
+      </w:r>
+      <w:r>
+        <w:t xml:space="preserve"> → partie </w:t>
+      </w:r>
+      <w:r>
+        <w:rPr>
+          <w:b/>
+          <w:bCs/>
+        </w:rPr>
+        <w:t xml:space="preserve">Équipe</w:t>
+      </w:r>
+      <w:r>
+        <w:t xml:space="preserve"> :</w:t>
+      </w:r>
+    </w:p>
+    <w:p>
+      <w:pPr>
+        <w:pStyle w:val="ListParagraph"/>
+        <w:numPr>
+          <w:ilvl w:val="0"/>
+          <w:numId w:val="3"/>
+        </w:numPr>
+        <w:spacing w:after="80"/>
+      </w:pPr>
+      <w:r>
+        <w:rPr>
+          <w:b/>
+          <w:bCs/>
+        </w:rPr>
+        <w:t xml:space="preserve">Ajouter</w:t>
+      </w:r>
+      <w:r>
+        <w:t xml:space="preserve"> une personne : nom, mot de passe provisoire, rôle → </w:t>
+      </w:r>
+      <w:r>
+        <w:rPr>
+          <w:b/>
+          <w:bCs/>
+        </w:rPr>
+        <w:t xml:space="preserve">Ajouter</w:t>
+      </w:r>
+      <w:r>
+        <w:t xml:space="preserve">. Elle reçoit automatiquement son groupe « Perso ».</w:t>
+      </w:r>
+    </w:p>
+    <w:p>
+      <w:pPr>
+        <w:pStyle w:val="ListParagraph"/>
+        <w:numPr>
+          <w:ilvl w:val="0"/>
+          <w:numId w:val="3"/>
+        </w:numPr>
+        <w:spacing w:after="80"/>
+      </w:pPr>
+      <w:r>
+        <w:rPr>
+          <w:b/>
+          <w:bCs/>
+        </w:rPr>
+        <w:t xml:space="preserve">Le crayon</w:t>
+      </w:r>
+      <w:r>
+        <w:t xml:space="preserve"> sur une ligne permet de : renommer, donner un </w:t>
+      </w:r>
+      <w:r>
+        <w:rPr>
+          <w:b/>
+          <w:bCs/>
+        </w:rPr>
+        <w:t xml:space="preserve">nouveau mot de passe</w:t>
+      </w:r>
+      <w:r>
+        <w:t xml:space="preserve"> (oubli), changer le rôle, ou </w:t>
+      </w:r>
+      <w:r>
+        <w:rPr>
+          <w:b/>
+          <w:bCs/>
+        </w:rPr>
+        <w:t xml:space="preserve">désactiver</w:t>
+      </w:r>
+      <w:r>
+        <w:t xml:space="preserve"> le compte (case « Compte actif »).</w:t>
+      </w:r>
+    </w:p>
+    <w:p>
+      <w:pPr>
+        <w:pStyle w:val="ListParagraph"/>
+        <w:numPr>
+          <w:ilvl w:val="0"/>
+          <w:numId w:val="3"/>
+        </w:numPr>
+        <w:spacing w:after="80"/>
+      </w:pPr>
+      <w:r>
+        <w:t xml:space="preserve">Un compte désactivé ne peut plus se connecter, mais </w:t>
+      </w:r>
+      <w:r>
+        <w:rPr>
+          <w:b/>
+          <w:bCs/>
+        </w:rPr>
+        <w:t xml:space="preserve">ses tâches restent</w:t>
+      </w:r>
+      <w:r>
+        <w:t xml:space="preserve">. On peut le réactiver à tout moment.</w:t>
+      </w:r>
+    </w:p>
+    <w:p>
+      <w:pPr>
+        <w:pStyle w:val="ListParagraph"/>
+        <w:numPr>
+          <w:ilvl w:val="0"/>
+          <w:numId w:val="3"/>
+        </w:numPr>
+        <w:spacing w:after="80"/>
+      </w:pPr>
+      <w:r>
+        <w:t xml:space="preserve">Il reste toujours au moins un administrateur actif (l'application l'empêche autrement).</w:t>
       </w:r>
     </w:p>
     <w:p>
@@ -5990,9 +5846,9 @@
       <w:r>
         <w:drawing>
           <wp:inline distT="0" distB="0" distL="0" distR="0">
-            <wp:extent cx="5143500" cy="3219450"/>
+            <wp:extent cx="5334000" cy="3752850"/>
             <wp:effectExtent t="0" r="0" b="0" l="0"/>
-            <wp:docPr id="1" name="17-historique.png" descr="L'historique : une ligne ouverte montre qui a validé chaque étape." title="L'historique : une ligne ouverte montre qui a validé chaque étape."/>
+            <wp:docPr id="1" name="12-equipe.png" descr="Modification d'un compte depuis la liste de l'équipe." title="Modification d'un compte depuis la liste de l'équipe."/>
             <wp:cNvGraphicFramePr>
               <a:graphicFrameLocks xmlns:a="http://schemas.openxmlformats.org/drawingml/2006/main" noChangeAspect="1"/>
             </wp:cNvGraphicFramePr>
@@ -6015,7 +5871,7 @@
                   <pic:spPr bwMode="auto">
                     <a:xfrm>
                       <a:off x="0" y="0"/>
-                      <a:ext cx="5143500" cy="3219450"/>
+                      <a:ext cx="5334000" cy="3752850"/>
                     </a:xfrm>
                     <a:prstGeom prst="rect">
                       <a:avLst/>
@@ -6041,7 +5897,7 @@
           <w:sz w:val="18"/>
           <w:szCs w:val="18"/>
         </w:rPr>
-        <w:t xml:space="preserve">L'historique : une ligne ouverte montre qui a validé chaque étape.</w:t>
+        <w:t xml:space="preserve">Modification d'un compte depuis la liste de l'équipe.</w:t>
       </w:r>
     </w:p>
     <w:p>
@@ -6049,7 +5905,7 @@
         <w:pStyle w:val="Heading2"/>
       </w:pPr>
       <w:r>
-        <w:t xml:space="preserve">Sauvegarde</w:t>
+        <w:t xml:space="preserve">L'historique des tâches terminées</w:t>
       </w:r>
     </w:p>
     <w:p>
@@ -6057,82 +5913,37 @@
         <w:spacing w:after="120"/>
       </w:pPr>
       <w:r>
-        <w:rPr>
-          <w:b/>
-          <w:bCs/>
-        </w:rPr>
-        <w:t xml:space="preserve">Compte</w:t>
-      </w:r>
-      <w:r>
-        <w:t xml:space="preserve"> → </w:t>
-      </w:r>
-      <w:r>
-        <w:rPr>
-          <w:b/>
-          <w:bCs/>
-        </w:rPr>
-        <w:t xml:space="preserve">Télécharger une sauvegarde complète</w:t>
-      </w:r>
-      <w:r>
-        <w:t xml:space="preserve"> : une copie de toute la base, à ranger sur une clé USB ou un disque réseau. Une sauvegarde est aussi faite automatiquement chaque jour sur le PC serveur.</w:t>
-      </w:r>
-    </w:p>
-    <w:p>
-      <w:pPr>
-        <w:pStyle w:val="Heading1"/>
-        <w:keepNext/>
-        <w:pageBreakBefore/>
-      </w:pPr>
-      <w:r>
-        <w:t xml:space="preserve">12. Sur tablette et téléphone</w:t>
-      </w:r>
-    </w:p>
-    <w:p>
-      <w:pPr>
-        <w:spacing w:after="120"/>
-      </w:pPr>
-      <w:r>
-        <w:t xml:space="preserve">L'application s'adapte aux petits écrans. Sur le Wi-Fi du bureau, ouvrez la même adresse, puis ajoutez-la à l'écran d'accueil (Chrome : menu </w:t>
-      </w:r>
-      <w:r>
-        <w:rPr>
-          <w:b/>
-          <w:bCs/>
-        </w:rPr>
-        <w:t xml:space="preserve">⋮</w:t>
-      </w:r>
-      <w:r>
-        <w:t xml:space="preserve"> → </w:t>
-      </w:r>
-      <w:r>
-        <w:rPr>
-          <w:b/>
-          <w:bCs/>
-        </w:rPr>
-        <w:t xml:space="preserve">Ajouter à l'écran d'accueil</w:t>
-      </w:r>
-      <w:r>
-        <w:t xml:space="preserve"> ; iPad : </w:t>
-      </w:r>
-      <w:r>
-        <w:rPr>
-          <w:b/>
-          <w:bCs/>
-        </w:rPr>
-        <w:t xml:space="preserve">Partager</w:t>
-      </w:r>
-      <w:r>
-        <w:t xml:space="preserve"> → </w:t>
-      </w:r>
-      <w:r>
-        <w:rPr>
-          <w:b/>
-          <w:bCs/>
-        </w:rPr>
-        <w:t xml:space="preserve">Sur l'écran d'accueil</w:t>
-      </w:r>
-      <w:r>
-        <w:t xml:space="preserve">).</w:t>
+        <w:t xml:space="preserve">L'onglet </w:t>
+      </w:r>
+      <w:r>
+        <w:rPr>
+          <w:b/>
+          <w:bCs/>
+        </w:rPr>
+        <w:t xml:space="preserve">Historique</w:t>
+      </w:r>
+      <w:r>
+        <w:t xml:space="preserve"> (visible par l'administrateur uniquement) liste toutes les tâches terminées : date, tâche, groupe, </w:t>
+      </w:r>
+      <w:r>
+        <w:rPr>
+          <w:b/>
+          <w:bCs/>
+        </w:rPr>
+        <w:t xml:space="preserve">qui l'a validée</w:t>
+      </w:r>
+      <w:r>
+        <w:t xml:space="preserve">, et si elle est encore affichée ou déjà archivée (plus de 7 jours). Cliquez sur une ligne pour voir chaque étape avec </w:t>
+      </w:r>
+      <w:r>
+        <w:rPr>
+          <w:b/>
+          <w:bCs/>
+        </w:rPr>
+        <w:t xml:space="preserve">qui l'a cochée et quand</w:t>
+      </w:r>
+      <w:r>
+        <w:t xml:space="preserve">. La recherche et l'export Excel fonctionnent aussi ici.</w:t>
       </w:r>
     </w:p>
     <w:p>
@@ -6144,9 +5955,9 @@
       <w:r>
         <w:drawing>
           <wp:inline distT="0" distB="0" distL="0" distR="0">
-            <wp:extent cx="2857500" cy="5715000"/>
+            <wp:extent cx="5143500" cy="3219450"/>
             <wp:effectExtent t="0" r="0" b="0" l="0"/>
-            <wp:docPr id="1" name="13-mobile.png" descr="L'accueil sur téléphone." title="L'accueil sur téléphone."/>
+            <wp:docPr id="1" name="17-historique.png" descr="L'historique : une ligne ouverte montre qui a validé chaque étape." title="L'historique : une ligne ouverte montre qui a validé chaque étape."/>
             <wp:cNvGraphicFramePr>
               <a:graphicFrameLocks xmlns:a="http://schemas.openxmlformats.org/drawingml/2006/main" noChangeAspect="1"/>
             </wp:cNvGraphicFramePr>
@@ -6169,6 +5980,173 @@
                   <pic:spPr bwMode="auto">
                     <a:xfrm>
                       <a:off x="0" y="0"/>
+                      <a:ext cx="5143500" cy="3219450"/>
+                    </a:xfrm>
+                    <a:prstGeom prst="rect">
+                      <a:avLst/>
+                    </a:prstGeom>
+                  </pic:spPr>
+                </pic:pic>
+              </a:graphicData>
+            </a:graphic>
+          </wp:inline>
+        </w:drawing>
+      </w:r>
+    </w:p>
+    <w:p>
+      <w:pPr>
+        <w:spacing w:after="200"/>
+        <w:jc w:val="center"/>
+      </w:pPr>
+      <w:r>
+        <w:rPr>
+          <w:i/>
+          <w:iCs/>
+          <w:color w:val="666A6F"/>
+          <w:sz w:val="18"/>
+          <w:szCs w:val="18"/>
+        </w:rPr>
+        <w:t xml:space="preserve">L'historique : une ligne ouverte montre qui a validé chaque étape.</w:t>
+      </w:r>
+    </w:p>
+    <w:p>
+      <w:pPr>
+        <w:pStyle w:val="Heading2"/>
+      </w:pPr>
+      <w:r>
+        <w:t xml:space="preserve">Sauvegarde</w:t>
+      </w:r>
+    </w:p>
+    <w:p>
+      <w:pPr>
+        <w:spacing w:after="120"/>
+      </w:pPr>
+      <w:r>
+        <w:rPr>
+          <w:b/>
+          <w:bCs/>
+        </w:rPr>
+        <w:t xml:space="preserve">Compte</w:t>
+      </w:r>
+      <w:r>
+        <w:t xml:space="preserve"> → </w:t>
+      </w:r>
+      <w:r>
+        <w:rPr>
+          <w:b/>
+          <w:bCs/>
+        </w:rPr>
+        <w:t xml:space="preserve">Télécharger une sauvegarde complète</w:t>
+      </w:r>
+      <w:r>
+        <w:t xml:space="preserve"> : une copie de toute la base, à ranger sur une clé USB ou un disque réseau. OVHcloud fait aussi des sauvegardes automatiques de la base de données. Le fichier téléchargé (</w:t>
+      </w:r>
+      <w:r>
+        <w:rPr>
+          <w:rFonts w:ascii="Consolas" w:cs="Consolas" w:eastAsia="Consolas" w:hAnsi="Consolas"/>
+          <w:color w:val="3D3A39"/>
+          <w:sz w:val="20"/>
+          <w:szCs w:val="20"/>
+          <w:shd w:fill="EDEAE8" w:color="auto" w:val="clear"/>
+        </w:rPr>
+        <w:t xml:space="preserve">.sql</w:t>
+      </w:r>
+      <w:r>
+        <w:t xml:space="preserve">) se réimporte dans phpMyAdmin (voir le guide d'installation).</w:t>
+      </w:r>
+    </w:p>
+    <w:p>
+      <w:pPr>
+        <w:pStyle w:val="Heading1"/>
+        <w:keepNext/>
+        <w:pageBreakBefore/>
+      </w:pPr>
+      <w:r>
+        <w:t xml:space="preserve">12. Sur tablette et téléphone</w:t>
+      </w:r>
+    </w:p>
+    <w:p>
+      <w:pPr>
+        <w:spacing w:after="120"/>
+      </w:pPr>
+      <w:r>
+        <w:t xml:space="preserve">L'application s'adapte aux petits écrans. Ouvrez la même adresse (ou scannez le QR code de la page Compte), puis ajoutez-la à l'écran d'accueil (Chrome : menu </w:t>
+      </w:r>
+      <w:r>
+        <w:rPr>
+          <w:b/>
+          <w:bCs/>
+        </w:rPr>
+        <w:t xml:space="preserve">⋮</w:t>
+      </w:r>
+      <w:r>
+        <w:t xml:space="preserve"> → </w:t>
+      </w:r>
+      <w:r>
+        <w:rPr>
+          <w:b/>
+          <w:bCs/>
+        </w:rPr>
+        <w:t xml:space="preserve">Ajouter à l'écran d'accueil</w:t>
+      </w:r>
+      <w:r>
+        <w:t xml:space="preserve"> ; iPad : </w:t>
+      </w:r>
+      <w:r>
+        <w:rPr>
+          <w:b/>
+          <w:bCs/>
+        </w:rPr>
+        <w:t xml:space="preserve">Partager</w:t>
+      </w:r>
+      <w:r>
+        <w:t xml:space="preserve"> → </w:t>
+      </w:r>
+      <w:r>
+        <w:rPr>
+          <w:b/>
+          <w:bCs/>
+        </w:rPr>
+        <w:t xml:space="preserve">Sur l'écran d'accueil</w:t>
+      </w:r>
+      <w:r>
+        <w:t xml:space="preserve">).</w:t>
+      </w:r>
+    </w:p>
+    <w:p>
+      <w:pPr>
+        <w:keepNext/>
+        <w:spacing w:after="60" w:before="120" w:line="240" w:lineRule="auto"/>
+        <w:jc w:val="center"/>
+      </w:pPr>
+      <w:r>
+        <w:drawing>
+          <wp:inline distT="0" distB="0" distL="0" distR="0">
+            <wp:extent cx="2857500" cy="5715000"/>
+            <wp:effectExtent t="0" r="0" b="0" l="0"/>
+            <wp:docPr id="1" name="13-mobile.png" descr="L'accueil sur téléphone." title="L'accueil sur téléphone."/>
+            <wp:cNvGraphicFramePr>
+              <a:graphicFrameLocks xmlns:a="http://schemas.openxmlformats.org/drawingml/2006/main" noChangeAspect="1"/>
+            </wp:cNvGraphicFramePr>
+            <a:graphic xmlns:a="http://schemas.openxmlformats.org/drawingml/2006/main">
+              <a:graphicData uri="http://schemas.openxmlformats.org/drawingml/2006/picture">
+                <pic:pic xmlns:pic="http://schemas.openxmlformats.org/drawingml/2006/picture">
+                  <pic:nvPicPr>
+                    <pic:cNvPr id="0" name="" descr=""/>
+                    <pic:cNvPicPr>
+                      <a:picLocks noChangeAspect="1" noChangeArrowheads="1"/>
+                    </pic:cNvPicPr>
+                  </pic:nvPicPr>
+                  <pic:blipFill>
+                    <a:blip r:embed="rId29" cstate="none"/>
+                    <a:srcRect/>
+                    <a:stretch>
+                      <a:fillRect/>
+                    </a:stretch>
+                  </pic:blipFill>
+                  <pic:spPr bwMode="auto">
+                    <a:xfrm>
+                      <a:off x="0" y="0"/>
                       <a:ext cx="2857500" cy="5715000"/>
                     </a:xfrm>
                     <a:prstGeom prst="rect">
@@ -6355,7 +6333,7 @@
               <w:spacing w:after="40"/>
             </w:pPr>
             <w:r>
-              <w:t xml:space="preserve">Ils apparaissent tout seuls en quelques secondes. Sinon, appuyez sur </w:t>
+              <w:t xml:space="preserve">Ils apparaissent tout seuls en quelques secondes (l'écran vérifie toutes les 5 secondes). Sinon, appuyez sur </w:t>
             </w:r>
             <w:r>
               <w:rPr>
@@ -6424,7 +6402,7 @@
               <w:spacing w:after="40"/>
             </w:pPr>
             <w:r>
-              <w:t xml:space="preserve">Le PC serveur est éteint ou en veille. L'application se reconnecte toute seule dès qu'il revient.</w:t>
+              <w:t xml:space="preserve">Votre connexion Internet est coupée. L'application se reconnecte toute seule dès qu'elle revient.</w:t>
             </w:r>
           </w:p>
         </w:tc>
@@ -6791,7 +6769,7 @@
               <w:spacing w:after="40"/>
             </w:pPr>
             <w:r>
-              <w:t xml:space="preserve">Puis-je utiliser l'application de chez moi ?</w:t>
+              <w:t xml:space="preserve">Puis-je utiliser l'application de chez moi ou sur un chantier ?</w:t>
             </w:r>
           </w:p>
         </w:tc>
@@ -6818,7 +6796,7 @@
               <w:spacing w:after="40"/>
             </w:pPr>
             <w:r>
-              <w:t xml:space="preserve">Non : elle ne fonctionne que sur le réseau du bureau, par sécurité.</w:t>
+              <w:t xml:space="preserve">Oui : le site est accessible partout où il y a Internet, avec votre nom et votre mot de passe.</w:t>
             </w:r>
           </w:p>
         </w:tc>

</xml_diff>